<commit_message>
Drafted Data overview section of report.
</commit_message>
<xml_diff>
--- a/results/2026-10_geneList_c_marshall/2026-10-15_iei-geneList_report.docx
+++ b/results/2026-10_geneList_c_marshall/2026-10-15_iei-geneList_report.docx
@@ -791,7 +791,15 @@
                 <w:sz w:val="20"/>
                 <w:szCs w:val="20"/>
               </w:rPr>
-              <w:t>griid_gene</w:t>
+              <w:t>human_gene_in_</w:t>
+            </w:r>
+            <w:r>
+              <w:rPr>
+                <w:rFonts w:ascii="Arial" w:hAnsi="Arial" w:cs="Arial"/>
+                <w:sz w:val="20"/>
+                <w:szCs w:val="20"/>
+              </w:rPr>
+              <w:t>griid</w:t>
             </w:r>
           </w:p>
         </w:tc>
@@ -885,6 +893,14 @@
                 <w:szCs w:val="20"/>
               </w:rPr>
             </w:pPr>
+            <w:r>
+              <w:rPr>
+                <w:rFonts w:ascii="Arial" w:hAnsi="Arial" w:cs="Arial"/>
+                <w:sz w:val="20"/>
+                <w:szCs w:val="20"/>
+              </w:rPr>
+              <w:t>blastp_*</w:t>
+            </w:r>
           </w:p>
         </w:tc>
         <w:tc>
@@ -901,6 +917,14 @@
                 <w:szCs w:val="20"/>
               </w:rPr>
             </w:pPr>
+            <w:r>
+              <w:rPr>
+                <w:rFonts w:ascii="Arial" w:hAnsi="Arial" w:cs="Arial"/>
+                <w:sz w:val="20"/>
+                <w:szCs w:val="20"/>
+              </w:rPr>
+              <w:t>BLASTp pairwise alignment results for the bacterial and human protein sequences; these annotations give evidence for sequence homology</w:t>
+            </w:r>
           </w:p>
         </w:tc>
       </w:tr>

</xml_diff>

<commit_message>
Drafted report. Discerned number of distinct human gene names in high-scoring dataset.
</commit_message>
<xml_diff>
--- a/results/2026-10_geneList_c_marshall/2026-10-15_iei-geneList_report.docx
+++ b/results/2026-10_geneList_c_marshall/2026-10-15_iei-geneList_report.docx
@@ -64,7 +64,7 @@
           <w:noProof/>
         </w:rPr>
         <w:drawing>
-          <wp:anchor distT="0" distB="0" distL="114300" distR="114300" simplePos="0" relativeHeight="251658240" behindDoc="0" locked="0" layoutInCell="1" allowOverlap="1" wp14:anchorId="01F13B50" wp14:editId="401D9AF9">
+          <wp:anchor distT="0" distB="0" distL="114300" distR="114300" simplePos="0" relativeHeight="251657216" behindDoc="0" locked="0" layoutInCell="1" allowOverlap="1" wp14:anchorId="01F13B50" wp14:editId="5171FCD4">
             <wp:simplePos x="0" y="0"/>
             <wp:positionH relativeFrom="column">
               <wp:posOffset>1838325</wp:posOffset>
@@ -408,7 +408,7 @@
           <w:sz w:val="22"/>
           <w:szCs w:val="22"/>
         </w:rPr>
-        <w:t xml:space="preserve"> a single bacterial-to-human protein pair, where the proteins in each pair exhibit structural homology. </w:t>
+        <w:t xml:space="preserve"> a single bacteria-to-human protein pair, where the proteins in each pair exhibit structural homology. </w:t>
       </w:r>
       <w:r>
         <w:rPr>
@@ -460,6 +460,139 @@
           <w:szCs w:val="22"/>
         </w:rPr>
         <w:t>as evidence in a larger clinical genomics discovery workflow.</w:t>
+      </w:r>
+      <w:r>
+        <w:rPr>
+          <w:rFonts w:ascii="Arial" w:hAnsi="Arial" w:cs="Arial"/>
+          <w:sz w:val="22"/>
+          <w:szCs w:val="22"/>
+        </w:rPr>
+        <w:t xml:space="preserve"> </w:t>
+      </w:r>
+    </w:p>
+    <w:p>
+      <w:pPr>
+        <w:spacing w:after="120" w:line="240" w:lineRule="auto"/>
+        <w:jc w:val="both"/>
+        <w:rPr>
+          <w:rFonts w:ascii="Arial" w:hAnsi="Arial" w:cs="Arial"/>
+          <w:sz w:val="22"/>
+          <w:szCs w:val="22"/>
+        </w:rPr>
+      </w:pPr>
+      <w:r>
+        <w:rPr>
+          <w:rFonts w:ascii="Arial" w:hAnsi="Arial" w:cs="Arial"/>
+          <w:sz w:val="22"/>
+          <w:szCs w:val="22"/>
+        </w:rPr>
+        <w:t xml:space="preserve">Protein pairs were filtered for </w:t>
+      </w:r>
+      <m:oMath>
+        <m:r>
+          <w:rPr>
+            <w:rFonts w:ascii="Cambria Math" w:hAnsi="Cambria Math" w:cs="Arial"/>
+            <w:sz w:val="22"/>
+            <w:szCs w:val="22"/>
+          </w:rPr>
+          <m:t>composit</m:t>
+        </m:r>
+        <m:r>
+          <w:rPr>
+            <w:rFonts w:ascii="Cambria Math" w:hAnsi="Cambria Math" w:cs="Arial"/>
+            <w:sz w:val="22"/>
+            <w:szCs w:val="22"/>
+          </w:rPr>
+          <m:t>e</m:t>
+        </m:r>
+        <m:r>
+          <w:rPr>
+            <w:rFonts w:ascii="Cambria Math" w:hAnsi="Cambria Math" w:cs="Arial"/>
+            <w:sz w:val="22"/>
+            <w:szCs w:val="22"/>
+          </w:rPr>
+          <m:t xml:space="preserve"> </m:t>
+        </m:r>
+        <m:r>
+          <w:rPr>
+            <w:rFonts w:ascii="Cambria Math" w:hAnsi="Cambria Math" w:cs="Arial"/>
+            <w:sz w:val="22"/>
+            <w:szCs w:val="22"/>
+          </w:rPr>
+          <m:t>score≥</m:t>
+        </m:r>
+        <m:r>
+          <w:rPr>
+            <w:rFonts w:ascii="Cambria Math" w:hAnsi="Cambria Math" w:cs="Arial"/>
+            <w:sz w:val="22"/>
+            <w:szCs w:val="22"/>
+          </w:rPr>
+          <m:t xml:space="preserve"> 0.85</m:t>
+        </m:r>
+      </m:oMath>
+      <w:r>
+        <w:rPr>
+          <w:rFonts w:ascii="Arial" w:eastAsiaTheme="minorEastAsia" w:hAnsi="Arial" w:cs="Arial"/>
+          <w:sz w:val="22"/>
+          <w:szCs w:val="22"/>
+        </w:rPr>
+        <w:t>, indicating strong evidence for structural homology</w:t>
+      </w:r>
+      <w:r>
+        <w:rPr>
+          <w:rFonts w:ascii="Arial" w:hAnsi="Arial" w:cs="Arial"/>
+          <w:sz w:val="22"/>
+          <w:szCs w:val="22"/>
+        </w:rPr>
+        <w:t>.</w:t>
+      </w:r>
+      <w:r>
+        <w:rPr>
+          <w:rFonts w:ascii="Arial" w:hAnsi="Arial" w:cs="Arial"/>
+          <w:sz w:val="22"/>
+          <w:szCs w:val="22"/>
+        </w:rPr>
+        <w:t xml:space="preserve"> For each unique human UniProt accession, only the highest-scoring bacteria-human protein pair </w:t>
+      </w:r>
+      <w:r>
+        <w:rPr>
+          <w:rFonts w:ascii="Arial" w:hAnsi="Arial" w:cs="Arial"/>
+          <w:sz w:val="22"/>
+          <w:szCs w:val="22"/>
+        </w:rPr>
+        <w:t>is</w:t>
+      </w:r>
+      <w:r>
+        <w:rPr>
+          <w:rFonts w:ascii="Arial" w:hAnsi="Arial" w:cs="Arial"/>
+          <w:sz w:val="22"/>
+          <w:szCs w:val="22"/>
+        </w:rPr>
+        <w:t xml:space="preserve"> included.</w:t>
+      </w:r>
+      <w:r>
+        <w:rPr>
+          <w:rFonts w:ascii="Arial" w:hAnsi="Arial" w:cs="Arial"/>
+          <w:sz w:val="22"/>
+          <w:szCs w:val="22"/>
+        </w:rPr>
+        <w:t xml:space="preserve"> The UniProt accessions map to 720 distinct human gene</w:t>
+      </w:r>
+      <w:r>
+        <w:rPr>
+          <w:rFonts w:ascii="Arial" w:hAnsi="Arial" w:cs="Arial"/>
+          <w:sz w:val="22"/>
+          <w:szCs w:val="22"/>
+        </w:rPr>
+        <w:t xml:space="preserve"> names</w:t>
+      </w:r>
+      <w:r>
+        <w:rPr>
+          <w:rFonts w:ascii="Arial" w:hAnsi="Arial" w:cs="Arial"/>
+          <w:sz w:val="22"/>
+          <w:szCs w:val="22"/>
+        </w:rPr>
+        <w:t>.</w:t>
       </w:r>
     </w:p>
     <w:p>
@@ -502,7 +635,23 @@
           <w:sz w:val="22"/>
           <w:szCs w:val="22"/>
         </w:rPr>
-        <w:t xml:space="preserve">data were generated by The Centre for Applied Genomics (TCAG) in collaboration with the Centre for Computational Medicine (CCM) at the Hospital for Sick Children. </w:t>
+        <w:t>data were generated by The Centre for Applied Genomics (TCAG)</w:t>
+      </w:r>
+      <w:r>
+        <w:rPr>
+          <w:rFonts w:ascii="Arial" w:hAnsi="Arial" w:cs="Arial"/>
+          <w:sz w:val="22"/>
+          <w:szCs w:val="22"/>
+        </w:rPr>
+        <w:t>, Chantel Trost lab, and the</w:t>
+      </w:r>
+      <w:r>
+        <w:rPr>
+          <w:rFonts w:ascii="Arial" w:hAnsi="Arial" w:cs="Arial"/>
+          <w:sz w:val="22"/>
+          <w:szCs w:val="22"/>
+        </w:rPr>
+        <w:t xml:space="preserve"> Centre for Computational Medicine (CCM) at the Hospital for Sick Children. </w:t>
       </w:r>
       <w:r>
         <w:rPr>
@@ -545,7 +694,7 @@
       </w:tblPr>
       <w:tblGrid>
         <w:gridCol w:w="2785"/>
-        <w:gridCol w:w="7285"/>
+        <w:gridCol w:w="6030"/>
       </w:tblGrid>
       <w:tr>
         <w:tc>
@@ -558,6 +707,8 @@
               <w:jc w:val="both"/>
               <w:rPr>
                 <w:rFonts w:ascii="Arial" w:hAnsi="Arial" w:cs="Arial"/>
+                <w:b/>
+                <w:bCs/>
                 <w:sz w:val="22"/>
                 <w:szCs w:val="22"/>
               </w:rPr>
@@ -565,6 +716,8 @@
             <w:r>
               <w:rPr>
                 <w:rFonts w:ascii="Arial" w:hAnsi="Arial" w:cs="Arial"/>
+                <w:b/>
+                <w:bCs/>
                 <w:sz w:val="22"/>
                 <w:szCs w:val="22"/>
               </w:rPr>
@@ -574,7 +727,7 @@
         </w:tc>
         <w:tc>
           <w:tcPr>
-            <w:tcW w:w="7285" w:type="dxa"/>
+            <w:tcW w:w="6030" w:type="dxa"/>
           </w:tcPr>
           <w:p>
             <w:pPr>
@@ -582,6 +735,8 @@
               <w:jc w:val="both"/>
               <w:rPr>
                 <w:rFonts w:ascii="Arial" w:hAnsi="Arial" w:cs="Arial"/>
+                <w:b/>
+                <w:bCs/>
                 <w:sz w:val="22"/>
                 <w:szCs w:val="22"/>
               </w:rPr>
@@ -589,6 +744,8 @@
             <w:r>
               <w:rPr>
                 <w:rFonts w:ascii="Arial" w:hAnsi="Arial" w:cs="Arial"/>
+                <w:b/>
+                <w:bCs/>
                 <w:sz w:val="22"/>
                 <w:szCs w:val="22"/>
               </w:rPr>
@@ -624,7 +781,7 @@
         </w:tc>
         <w:tc>
           <w:tcPr>
-            <w:tcW w:w="7285" w:type="dxa"/>
+            <w:tcW w:w="6030" w:type="dxa"/>
           </w:tcPr>
           <w:p>
             <w:pPr>
@@ -641,7 +798,23 @@
                 <w:sz w:val="20"/>
                 <w:szCs w:val="20"/>
               </w:rPr>
-              <w:t>Overall evidence score for structural homology out of 1.0. Incorporates the FoldSeek e-value, PyMOL-super root-mean-squared deviation (RMSD), TM-</w:t>
+              <w:t xml:space="preserve">Overall </w:t>
+            </w:r>
+            <w:r>
+              <w:rPr>
+                <w:rFonts w:ascii="Arial" w:hAnsi="Arial" w:cs="Arial"/>
+                <w:sz w:val="20"/>
+                <w:szCs w:val="20"/>
+              </w:rPr>
+              <w:t xml:space="preserve">in-house </w:t>
+            </w:r>
+            <w:r>
+              <w:rPr>
+                <w:rFonts w:ascii="Arial" w:hAnsi="Arial" w:cs="Arial"/>
+                <w:sz w:val="20"/>
+                <w:szCs w:val="20"/>
+              </w:rPr>
+              <w:t>evidence score for structural homology out of 1.0. Incorporates the FoldSeek e-value, PyMOL-super root-mean-squared deviation (RMSD), TM-</w:t>
             </w:r>
             <w:r>
               <w:rPr>
@@ -697,7 +870,7 @@
         </w:tc>
         <w:tc>
           <w:tcPr>
-            <w:tcW w:w="7285" w:type="dxa"/>
+            <w:tcW w:w="6030" w:type="dxa"/>
           </w:tcPr>
           <w:p>
             <w:pPr>
@@ -747,7 +920,7 @@
         </w:tc>
         <w:tc>
           <w:tcPr>
-            <w:tcW w:w="7285" w:type="dxa"/>
+            <w:tcW w:w="6030" w:type="dxa"/>
           </w:tcPr>
           <w:p>
             <w:pPr>
@@ -805,7 +978,7 @@
         </w:tc>
         <w:tc>
           <w:tcPr>
-            <w:tcW w:w="7285" w:type="dxa"/>
+            <w:tcW w:w="6030" w:type="dxa"/>
           </w:tcPr>
           <w:p>
             <w:pPr>
@@ -855,7 +1028,7 @@
         </w:tc>
         <w:tc>
           <w:tcPr>
-            <w:tcW w:w="7285" w:type="dxa"/>
+            <w:tcW w:w="6030" w:type="dxa"/>
           </w:tcPr>
           <w:p>
             <w:pPr>
@@ -873,7 +1046,39 @@
                 <w:sz w:val="20"/>
                 <w:szCs w:val="20"/>
               </w:rPr>
-              <w:t>Boolean value indicating whether the human protein maps to a gene on the IUIS-IEI working group's 2025 gene panel</w:t>
+              <w:t xml:space="preserve">Boolean value indicating whether the human protein maps to a gene on the </w:t>
+            </w:r>
+            <w:r>
+              <w:rPr>
+                <w:rFonts w:ascii="Arial" w:hAnsi="Arial" w:cs="Arial"/>
+                <w:sz w:val="20"/>
+                <w:szCs w:val="20"/>
+              </w:rPr>
+              <w:t xml:space="preserve">International Union of Immunological Societies (IUIS) </w:t>
+            </w:r>
+            <w:r>
+              <w:rPr>
+                <w:rFonts w:ascii="Arial" w:hAnsi="Arial" w:cs="Arial"/>
+                <w:sz w:val="20"/>
+                <w:szCs w:val="20"/>
+              </w:rPr>
+              <w:t xml:space="preserve">IEI </w:t>
+            </w:r>
+            <w:r>
+              <w:rPr>
+                <w:rFonts w:ascii="Arial" w:hAnsi="Arial" w:cs="Arial"/>
+                <w:sz w:val="20"/>
+                <w:szCs w:val="20"/>
+              </w:rPr>
+              <w:t>expert committee</w:t>
+            </w:r>
+            <w:r>
+              <w:rPr>
+                <w:rFonts w:ascii="Arial" w:hAnsi="Arial" w:cs="Arial"/>
+                <w:sz w:val="20"/>
+                <w:szCs w:val="20"/>
+              </w:rPr>
+              <w:t>'s 2025 gene panel</w:t>
             </w:r>
           </w:p>
         </w:tc>
@@ -905,7 +1110,7 @@
         </w:tc>
         <w:tc>
           <w:tcPr>
-            <w:tcW w:w="7285" w:type="dxa"/>
+            <w:tcW w:w="6030" w:type="dxa"/>
           </w:tcPr>
           <w:p>
             <w:pPr>
@@ -925,482 +1130,136 @@
               </w:rPr>
               <w:t>BLASTp pairwise alignment results for the bacterial and human protein sequences; these annotations give evidence for sequence homology</w:t>
             </w:r>
-          </w:p>
-        </w:tc>
-      </w:tr>
-      <w:tr>
-        <w:tc>
-          <w:tcPr>
-            <w:tcW w:w="2785" w:type="dxa"/>
-          </w:tcPr>
-          <w:p>
-            <w:pPr>
-              <w:spacing w:after="120"/>
-              <w:jc w:val="both"/>
-              <w:rPr>
-                <w:rFonts w:ascii="Arial" w:hAnsi="Arial" w:cs="Arial"/>
-                <w:sz w:val="20"/>
-                <w:szCs w:val="20"/>
-              </w:rPr>
-            </w:pPr>
-          </w:p>
-        </w:tc>
-        <w:tc>
-          <w:tcPr>
-            <w:tcW w:w="7285" w:type="dxa"/>
-          </w:tcPr>
-          <w:p>
-            <w:pPr>
-              <w:spacing w:after="120"/>
-              <w:jc w:val="both"/>
-              <w:rPr>
-                <w:rFonts w:ascii="Arial" w:hAnsi="Arial" w:cs="Arial"/>
-                <w:sz w:val="20"/>
-                <w:szCs w:val="20"/>
-              </w:rPr>
-            </w:pPr>
-          </w:p>
-        </w:tc>
-      </w:tr>
-      <w:tr>
-        <w:tc>
-          <w:tcPr>
-            <w:tcW w:w="2785" w:type="dxa"/>
-          </w:tcPr>
-          <w:p>
-            <w:pPr>
-              <w:spacing w:after="120"/>
-              <w:jc w:val="both"/>
-              <w:rPr>
-                <w:rFonts w:ascii="Arial" w:hAnsi="Arial" w:cs="Arial"/>
-                <w:sz w:val="20"/>
-                <w:szCs w:val="20"/>
-              </w:rPr>
-            </w:pPr>
-          </w:p>
-        </w:tc>
-        <w:tc>
-          <w:tcPr>
-            <w:tcW w:w="7285" w:type="dxa"/>
-          </w:tcPr>
-          <w:p>
-            <w:pPr>
-              <w:spacing w:after="120"/>
-              <w:jc w:val="both"/>
-              <w:rPr>
-                <w:rFonts w:ascii="Arial" w:hAnsi="Arial" w:cs="Arial"/>
-                <w:sz w:val="20"/>
-                <w:szCs w:val="20"/>
-              </w:rPr>
-            </w:pPr>
-          </w:p>
-        </w:tc>
-      </w:tr>
-      <w:tr>
-        <w:tc>
-          <w:tcPr>
-            <w:tcW w:w="2785" w:type="dxa"/>
-          </w:tcPr>
-          <w:p>
-            <w:pPr>
-              <w:spacing w:after="120"/>
-              <w:jc w:val="both"/>
-              <w:rPr>
-                <w:rFonts w:ascii="Arial" w:hAnsi="Arial" w:cs="Arial"/>
-                <w:sz w:val="20"/>
-                <w:szCs w:val="20"/>
-              </w:rPr>
-            </w:pPr>
-          </w:p>
-        </w:tc>
-        <w:tc>
-          <w:tcPr>
-            <w:tcW w:w="7285" w:type="dxa"/>
-          </w:tcPr>
-          <w:p>
-            <w:pPr>
-              <w:spacing w:after="120"/>
-              <w:jc w:val="both"/>
-              <w:rPr>
-                <w:rFonts w:ascii="Arial" w:hAnsi="Arial" w:cs="Arial"/>
-                <w:sz w:val="20"/>
-                <w:szCs w:val="20"/>
-              </w:rPr>
-            </w:pPr>
-          </w:p>
-        </w:tc>
-      </w:tr>
-      <w:tr>
-        <w:tc>
-          <w:tcPr>
-            <w:tcW w:w="2785" w:type="dxa"/>
-          </w:tcPr>
-          <w:p>
-            <w:pPr>
-              <w:spacing w:after="120"/>
-              <w:jc w:val="both"/>
-              <w:rPr>
-                <w:rFonts w:ascii="Arial" w:hAnsi="Arial" w:cs="Arial"/>
-                <w:sz w:val="20"/>
-                <w:szCs w:val="20"/>
-              </w:rPr>
-            </w:pPr>
-          </w:p>
-        </w:tc>
-        <w:tc>
-          <w:tcPr>
-            <w:tcW w:w="7285" w:type="dxa"/>
-          </w:tcPr>
-          <w:p>
-            <w:pPr>
-              <w:spacing w:after="120"/>
-              <w:jc w:val="both"/>
-              <w:rPr>
-                <w:rFonts w:ascii="Arial" w:hAnsi="Arial" w:cs="Arial"/>
-                <w:sz w:val="20"/>
-                <w:szCs w:val="20"/>
-              </w:rPr>
-            </w:pPr>
-          </w:p>
-        </w:tc>
-      </w:tr>
-      <w:tr>
-        <w:tc>
-          <w:tcPr>
-            <w:tcW w:w="2785" w:type="dxa"/>
-          </w:tcPr>
-          <w:p>
-            <w:pPr>
-              <w:spacing w:after="120"/>
-              <w:jc w:val="both"/>
-              <w:rPr>
-                <w:rFonts w:ascii="Arial" w:hAnsi="Arial" w:cs="Arial"/>
-                <w:sz w:val="20"/>
-                <w:szCs w:val="20"/>
-              </w:rPr>
-            </w:pPr>
-          </w:p>
-        </w:tc>
-        <w:tc>
-          <w:tcPr>
-            <w:tcW w:w="7285" w:type="dxa"/>
-          </w:tcPr>
-          <w:p>
-            <w:pPr>
-              <w:spacing w:after="120"/>
-              <w:jc w:val="both"/>
-              <w:rPr>
-                <w:rFonts w:ascii="Arial" w:hAnsi="Arial" w:cs="Arial"/>
-                <w:sz w:val="20"/>
-                <w:szCs w:val="20"/>
-              </w:rPr>
-            </w:pPr>
-          </w:p>
-        </w:tc>
-      </w:tr>
-      <w:tr>
-        <w:tc>
-          <w:tcPr>
-            <w:tcW w:w="2785" w:type="dxa"/>
-          </w:tcPr>
-          <w:p>
-            <w:pPr>
-              <w:spacing w:after="120"/>
-              <w:jc w:val="both"/>
-              <w:rPr>
-                <w:rFonts w:ascii="Arial" w:hAnsi="Arial" w:cs="Arial"/>
-                <w:sz w:val="20"/>
-                <w:szCs w:val="20"/>
-              </w:rPr>
-            </w:pPr>
-          </w:p>
-        </w:tc>
-        <w:tc>
-          <w:tcPr>
-            <w:tcW w:w="7285" w:type="dxa"/>
-          </w:tcPr>
-          <w:p>
-            <w:pPr>
-              <w:spacing w:after="120"/>
-              <w:jc w:val="both"/>
-              <w:rPr>
-                <w:rFonts w:ascii="Arial" w:hAnsi="Arial" w:cs="Arial"/>
-                <w:sz w:val="20"/>
-                <w:szCs w:val="20"/>
-              </w:rPr>
-            </w:pPr>
-          </w:p>
-        </w:tc>
-      </w:tr>
-      <w:tr>
-        <w:tc>
-          <w:tcPr>
-            <w:tcW w:w="2785" w:type="dxa"/>
-          </w:tcPr>
-          <w:p>
-            <w:pPr>
-              <w:spacing w:after="120"/>
-              <w:jc w:val="both"/>
-              <w:rPr>
-                <w:rFonts w:ascii="Arial" w:hAnsi="Arial" w:cs="Arial"/>
-                <w:sz w:val="20"/>
-                <w:szCs w:val="20"/>
-              </w:rPr>
-            </w:pPr>
-          </w:p>
-        </w:tc>
-        <w:tc>
-          <w:tcPr>
-            <w:tcW w:w="7285" w:type="dxa"/>
-          </w:tcPr>
-          <w:p>
-            <w:pPr>
-              <w:spacing w:after="120"/>
-              <w:jc w:val="both"/>
-              <w:rPr>
-                <w:rFonts w:ascii="Arial" w:hAnsi="Arial" w:cs="Arial"/>
-                <w:sz w:val="20"/>
-                <w:szCs w:val="20"/>
-              </w:rPr>
-            </w:pPr>
-          </w:p>
-        </w:tc>
-      </w:tr>
-      <w:tr>
-        <w:tc>
-          <w:tcPr>
-            <w:tcW w:w="2785" w:type="dxa"/>
-          </w:tcPr>
-          <w:p>
-            <w:pPr>
-              <w:spacing w:after="40"/>
-              <w:jc w:val="both"/>
-              <w:rPr>
-                <w:rFonts w:ascii="Arial" w:hAnsi="Arial" w:cs="Arial"/>
-                <w:sz w:val="20"/>
-                <w:szCs w:val="20"/>
-              </w:rPr>
-            </w:pPr>
-          </w:p>
-        </w:tc>
-        <w:tc>
-          <w:tcPr>
-            <w:tcW w:w="7285" w:type="dxa"/>
-          </w:tcPr>
-          <w:p>
-            <w:pPr>
-              <w:spacing w:after="40"/>
-              <w:jc w:val="both"/>
-              <w:rPr>
-                <w:rFonts w:ascii="Arial" w:hAnsi="Arial" w:cs="Arial"/>
-                <w:sz w:val="20"/>
-                <w:szCs w:val="20"/>
-              </w:rPr>
-            </w:pPr>
-          </w:p>
-        </w:tc>
-      </w:tr>
-      <w:tr>
-        <w:tc>
-          <w:tcPr>
-            <w:tcW w:w="2785" w:type="dxa"/>
-          </w:tcPr>
-          <w:p>
-            <w:pPr>
-              <w:spacing w:after="40"/>
-              <w:jc w:val="both"/>
-              <w:rPr>
-                <w:rFonts w:ascii="Arial" w:hAnsi="Arial" w:cs="Arial"/>
-                <w:sz w:val="20"/>
-                <w:szCs w:val="20"/>
-              </w:rPr>
-            </w:pPr>
-          </w:p>
-        </w:tc>
-        <w:tc>
-          <w:tcPr>
-            <w:tcW w:w="7285" w:type="dxa"/>
-          </w:tcPr>
-          <w:p>
-            <w:pPr>
-              <w:spacing w:after="40"/>
-              <w:jc w:val="both"/>
-              <w:rPr>
-                <w:rFonts w:ascii="Arial" w:hAnsi="Arial" w:cs="Arial"/>
-                <w:sz w:val="20"/>
-                <w:szCs w:val="20"/>
-              </w:rPr>
-            </w:pPr>
-          </w:p>
-        </w:tc>
-      </w:tr>
-      <w:tr>
-        <w:tc>
-          <w:tcPr>
-            <w:tcW w:w="2785" w:type="dxa"/>
-          </w:tcPr>
-          <w:p>
-            <w:pPr>
-              <w:spacing w:after="40"/>
-              <w:jc w:val="both"/>
-              <w:rPr>
-                <w:rFonts w:ascii="Arial" w:hAnsi="Arial" w:cs="Arial"/>
-                <w:sz w:val="20"/>
-                <w:szCs w:val="20"/>
-              </w:rPr>
-            </w:pPr>
-          </w:p>
-        </w:tc>
-        <w:tc>
-          <w:tcPr>
-            <w:tcW w:w="7285" w:type="dxa"/>
-          </w:tcPr>
-          <w:p>
-            <w:pPr>
-              <w:spacing w:after="40"/>
-              <w:jc w:val="both"/>
-              <w:rPr>
-                <w:rFonts w:ascii="Arial" w:hAnsi="Arial" w:cs="Arial"/>
-                <w:sz w:val="20"/>
-                <w:szCs w:val="20"/>
-              </w:rPr>
-            </w:pPr>
-          </w:p>
-        </w:tc>
-      </w:tr>
-      <w:tr>
-        <w:tc>
-          <w:tcPr>
-            <w:tcW w:w="2785" w:type="dxa"/>
-          </w:tcPr>
-          <w:p>
-            <w:pPr>
-              <w:spacing w:after="40"/>
-              <w:jc w:val="both"/>
-              <w:rPr>
-                <w:rFonts w:ascii="Arial" w:hAnsi="Arial" w:cs="Arial"/>
-                <w:sz w:val="20"/>
-                <w:szCs w:val="20"/>
-              </w:rPr>
-            </w:pPr>
-          </w:p>
-        </w:tc>
-        <w:tc>
-          <w:tcPr>
-            <w:tcW w:w="7285" w:type="dxa"/>
-          </w:tcPr>
-          <w:p>
-            <w:pPr>
-              <w:spacing w:after="40"/>
-              <w:jc w:val="both"/>
-              <w:rPr>
-                <w:rFonts w:ascii="Arial" w:hAnsi="Arial" w:cs="Arial"/>
-                <w:sz w:val="20"/>
-                <w:szCs w:val="20"/>
-              </w:rPr>
-            </w:pPr>
-          </w:p>
-        </w:tc>
-      </w:tr>
-      <w:tr>
-        <w:tc>
-          <w:tcPr>
-            <w:tcW w:w="2785" w:type="dxa"/>
-          </w:tcPr>
-          <w:p>
-            <w:pPr>
-              <w:spacing w:after="40"/>
-              <w:jc w:val="both"/>
-              <w:rPr>
-                <w:rFonts w:ascii="Arial" w:hAnsi="Arial" w:cs="Arial"/>
-                <w:sz w:val="20"/>
-                <w:szCs w:val="20"/>
-              </w:rPr>
-            </w:pPr>
-          </w:p>
-        </w:tc>
-        <w:tc>
-          <w:tcPr>
-            <w:tcW w:w="7285" w:type="dxa"/>
-          </w:tcPr>
-          <w:p>
-            <w:pPr>
-              <w:spacing w:after="40"/>
-              <w:jc w:val="both"/>
-              <w:rPr>
-                <w:rFonts w:ascii="Arial" w:hAnsi="Arial" w:cs="Arial"/>
-                <w:sz w:val="20"/>
-                <w:szCs w:val="20"/>
-              </w:rPr>
-            </w:pPr>
-          </w:p>
-        </w:tc>
-      </w:tr>
-      <w:tr>
-        <w:tc>
-          <w:tcPr>
-            <w:tcW w:w="2785" w:type="dxa"/>
-          </w:tcPr>
-          <w:p>
-            <w:pPr>
-              <w:spacing w:after="40"/>
-              <w:jc w:val="both"/>
-              <w:rPr>
-                <w:rFonts w:ascii="Arial" w:hAnsi="Arial" w:cs="Arial"/>
-                <w:sz w:val="20"/>
-                <w:szCs w:val="20"/>
-              </w:rPr>
-            </w:pPr>
-          </w:p>
-        </w:tc>
-        <w:tc>
-          <w:tcPr>
-            <w:tcW w:w="7285" w:type="dxa"/>
-          </w:tcPr>
-          <w:p>
-            <w:pPr>
-              <w:spacing w:after="40"/>
-              <w:jc w:val="both"/>
-              <w:rPr>
-                <w:rFonts w:ascii="Arial" w:hAnsi="Arial" w:cs="Arial"/>
-                <w:sz w:val="20"/>
-                <w:szCs w:val="20"/>
-              </w:rPr>
-            </w:pPr>
-          </w:p>
-        </w:tc>
-      </w:tr>
-      <w:tr>
-        <w:tc>
-          <w:tcPr>
-            <w:tcW w:w="2785" w:type="dxa"/>
-          </w:tcPr>
-          <w:p>
-            <w:pPr>
-              <w:spacing w:after="40"/>
-              <w:jc w:val="both"/>
-              <w:rPr>
-                <w:rFonts w:ascii="Arial" w:hAnsi="Arial" w:cs="Arial"/>
-                <w:sz w:val="20"/>
-                <w:szCs w:val="20"/>
-              </w:rPr>
-            </w:pPr>
-          </w:p>
-        </w:tc>
-        <w:tc>
-          <w:tcPr>
-            <w:tcW w:w="7285" w:type="dxa"/>
-          </w:tcPr>
-          <w:p>
-            <w:pPr>
-              <w:spacing w:after="40"/>
-              <w:jc w:val="both"/>
-              <w:rPr>
-                <w:rFonts w:ascii="Arial" w:hAnsi="Arial" w:cs="Arial"/>
-                <w:sz w:val="20"/>
-                <w:szCs w:val="20"/>
-              </w:rPr>
-            </w:pPr>
+            <w:r>
+              <w:rPr>
+                <w:rFonts w:ascii="Arial" w:hAnsi="Arial" w:cs="Arial"/>
+                <w:sz w:val="20"/>
+                <w:szCs w:val="20"/>
+              </w:rPr>
+              <w:t xml:space="preserve">. Note that </w:t>
+            </w:r>
+            <w:r>
+              <w:rPr>
+                <w:rFonts w:ascii="Arial" w:hAnsi="Arial" w:cs="Arial"/>
+                <w:sz w:val="20"/>
+                <w:szCs w:val="20"/>
+              </w:rPr>
+              <w:t xml:space="preserve">BLASTp </w:t>
+            </w:r>
+            <w:r>
+              <w:rPr>
+                <w:rFonts w:ascii="Arial" w:hAnsi="Arial" w:cs="Arial"/>
+                <w:sz w:val="20"/>
+                <w:szCs w:val="20"/>
+              </w:rPr>
+              <w:t xml:space="preserve">e-values and </w:t>
+            </w:r>
+            <w:r>
+              <w:rPr>
+                <w:rFonts w:ascii="Arial" w:hAnsi="Arial" w:cs="Arial"/>
+                <w:sz w:val="20"/>
+                <w:szCs w:val="20"/>
+              </w:rPr>
+              <w:t>bit</w:t>
+            </w:r>
+            <w:r>
+              <w:rPr>
+                <w:rFonts w:ascii="Arial" w:hAnsi="Arial" w:cs="Arial"/>
+                <w:sz w:val="20"/>
+                <w:szCs w:val="20"/>
+              </w:rPr>
+              <w:t xml:space="preserve">scores are stronger than typical BLASTp results as the alignment is pairwise. </w:t>
+            </w:r>
+            <w:r>
+              <w:rPr>
+                <w:rFonts w:ascii="Arial" w:eastAsiaTheme="minorEastAsia" w:hAnsi="Arial" w:cs="Arial"/>
+                <w:sz w:val="20"/>
+                <w:szCs w:val="20"/>
+              </w:rPr>
+              <w:t xml:space="preserve">BLASTp </w:t>
+            </w:r>
+            <m:oMath>
+              <m:r>
+                <w:rPr>
+                  <w:rFonts w:ascii="Cambria Math" w:hAnsi="Cambria Math" w:cs="Arial"/>
+                  <w:sz w:val="20"/>
+                  <w:szCs w:val="20"/>
+                </w:rPr>
+                <m:t>evalue</m:t>
+              </m:r>
+              <m:r>
+                <w:rPr>
+                  <w:rFonts w:ascii="Cambria Math" w:hAnsi="Cambria Math" w:cs="Arial"/>
+                  <w:sz w:val="20"/>
+                  <w:szCs w:val="20"/>
+                </w:rPr>
+                <m:t>≤</m:t>
+              </m:r>
+              <m:r>
+                <w:rPr>
+                  <w:rFonts w:ascii="Cambria Math" w:hAnsi="Cambria Math" w:cs="Arial"/>
+                  <w:sz w:val="20"/>
+                  <w:szCs w:val="20"/>
+                </w:rPr>
+                <m:t xml:space="preserve"> </m:t>
+              </m:r>
+              <m:sSup>
+                <m:sSupPr>
+                  <m:ctrlPr>
+                    <w:rPr>
+                      <w:rFonts w:ascii="Cambria Math" w:hAnsi="Cambria Math" w:cs="Arial"/>
+                      <w:i/>
+                      <w:sz w:val="20"/>
+                      <w:szCs w:val="20"/>
+                    </w:rPr>
+                  </m:ctrlPr>
+                </m:sSupPr>
+                <m:e>
+                  <m:r>
+                    <w:rPr>
+                      <w:rFonts w:ascii="Cambria Math" w:hAnsi="Cambria Math" w:cs="Arial"/>
+                      <w:sz w:val="20"/>
+                      <w:szCs w:val="20"/>
+                    </w:rPr>
+                    <m:t>10</m:t>
+                  </m:r>
+                </m:e>
+                <m:sup>
+                  <m:r>
+                    <w:rPr>
+                      <w:rFonts w:ascii="Cambria Math" w:hAnsi="Cambria Math" w:cs="Arial"/>
+                      <w:sz w:val="20"/>
+                      <w:szCs w:val="20"/>
+                    </w:rPr>
+                    <m:t>-3</m:t>
+                  </m:r>
+                </m:sup>
+              </m:sSup>
+            </m:oMath>
+            <w:r>
+              <w:rPr>
+                <w:rFonts w:ascii="Arial" w:eastAsiaTheme="minorEastAsia" w:hAnsi="Arial" w:cs="Arial"/>
+                <w:sz w:val="20"/>
+                <w:szCs w:val="20"/>
+              </w:rPr>
+              <w:t xml:space="preserve"> is the typical </w:t>
+            </w:r>
+            <w:r>
+              <w:rPr>
+                <w:rFonts w:ascii="Arial" w:eastAsiaTheme="minorEastAsia" w:hAnsi="Arial" w:cs="Arial"/>
+                <w:sz w:val="20"/>
+                <w:szCs w:val="20"/>
+              </w:rPr>
+              <w:t xml:space="preserve">permissive </w:t>
+            </w:r>
+            <w:r>
+              <w:rPr>
+                <w:rFonts w:ascii="Arial" w:eastAsiaTheme="minorEastAsia" w:hAnsi="Arial" w:cs="Arial"/>
+                <w:sz w:val="20"/>
+                <w:szCs w:val="20"/>
+              </w:rPr>
+              <w:t>threshold for significant sequence homology.</w:t>
+            </w:r>
           </w:p>
         </w:tc>
       </w:tr>
@@ -1419,7 +1278,6 @@
     <w:p>
       <w:pPr>
         <w:spacing w:after="0" w:line="240" w:lineRule="auto"/>
-        <w:jc w:val="center"/>
         <w:rPr>
           <w:rFonts w:ascii="Arial" w:hAnsi="Arial" w:cs="Arial"/>
         </w:rPr>
@@ -1436,30 +1294,1377 @@
     </w:p>
     <w:p>
       <w:pPr>
+        <w:rPr>
+          <w:rFonts w:ascii="Arial" w:hAnsi="Arial" w:cs="Arial"/>
+        </w:rPr>
+      </w:pPr>
+      <w:r>
+        <w:rPr>
+          <w:rFonts w:ascii="Arial" w:hAnsi="Arial" w:cs="Arial"/>
+        </w:rPr>
+        <w:br w:type="page"/>
+      </w:r>
+    </w:p>
+    <w:p>
+      <w:pPr>
         <w:spacing w:after="0" w:line="240" w:lineRule="auto"/>
         <w:rPr>
           <w:rFonts w:ascii="Arial" w:hAnsi="Arial" w:cs="Arial"/>
-        </w:rPr>
-      </w:pPr>
-      <w:r>
-        <w:rPr>
-          <w:rFonts w:ascii="Arial" w:hAnsi="Arial" w:cs="Arial"/>
+          <w:b/>
+          <w:bCs/>
+          <w:sz w:val="28"/>
+          <w:szCs w:val="28"/>
+        </w:rPr>
+      </w:pPr>
+      <w:r>
+        <w:rPr>
+          <w:rFonts w:ascii="Arial" w:hAnsi="Arial" w:cs="Arial"/>
+          <w:b/>
+          <w:bCs/>
+          <w:sz w:val="28"/>
+          <w:szCs w:val="28"/>
+        </w:rPr>
+        <w:lastRenderedPageBreak/>
+        <w:t>Composite scoring function</w:t>
+      </w:r>
+      <w:r>
+        <w:rPr>
+          <w:noProof/>
+        </w:rPr>
+        <w:t xml:space="preserve"> </w:t>
+      </w:r>
+    </w:p>
+    <w:p>
+      <w:pPr>
+        <w:spacing w:after="0" w:line="240" w:lineRule="auto"/>
+        <w:rPr>
+          <w:rFonts w:ascii="Arial" w:hAnsi="Arial" w:cs="Arial"/>
+          <w:b/>
+          <w:bCs/>
+          <w:sz w:val="28"/>
+          <w:szCs w:val="28"/>
+        </w:rPr>
+      </w:pPr>
+    </w:p>
+    <w:p>
+      <w:pPr>
+        <w:spacing w:after="120" w:line="240" w:lineRule="auto"/>
+        <w:rPr>
+          <w:rFonts w:ascii="Arial" w:hAnsi="Arial" w:cs="Arial"/>
+          <w:sz w:val="22"/>
+          <w:szCs w:val="22"/>
+        </w:rPr>
+      </w:pPr>
+      <w:r>
+        <w:rPr>
+          <w:rFonts w:ascii="Arial" w:hAnsi="Arial" w:cs="Arial"/>
+          <w:sz w:val="22"/>
+          <w:szCs w:val="22"/>
+        </w:rPr>
+        <w:t>The composite score for each pair by the following parameters. Each individual term is between 0.0 and 1.0 and is incorporated into a weighted sum that in turn yields a final score between 0.0 and 1.0:</w:t>
+      </w:r>
+    </w:p>
+    <w:p>
+      <w:pPr>
+        <w:spacing w:after="120" w:line="240" w:lineRule="auto"/>
+        <w:rPr>
+          <w:rFonts w:ascii="Arial" w:hAnsi="Arial" w:cs="Arial"/>
+          <w:sz w:val="22"/>
+          <w:szCs w:val="22"/>
+        </w:rPr>
+      </w:pPr>
+      <w:r>
+        <w:rPr>
+          <w:rFonts w:ascii="Arial" w:hAnsi="Arial" w:cs="Arial"/>
+          <w:noProof/>
+          <w:sz w:val="22"/>
+          <w:szCs w:val="22"/>
+        </w:rPr>
+        <w:drawing>
+          <wp:anchor distT="0" distB="0" distL="114300" distR="114300" simplePos="0" relativeHeight="251665408" behindDoc="0" locked="0" layoutInCell="1" allowOverlap="1" wp14:anchorId="6B3D65B5" wp14:editId="2D73C99D">
+            <wp:simplePos x="0" y="0"/>
+            <wp:positionH relativeFrom="margin">
+              <wp:posOffset>-45719</wp:posOffset>
+            </wp:positionH>
+            <wp:positionV relativeFrom="paragraph">
+              <wp:posOffset>162815</wp:posOffset>
+            </wp:positionV>
+            <wp:extent cx="5380122" cy="2212848"/>
+            <wp:effectExtent l="0" t="0" r="0" b="0"/>
+            <wp:wrapNone/>
+            <wp:docPr id="1100901431" name="Picture 2"/>
+            <wp:cNvGraphicFramePr>
+              <a:graphicFrameLocks xmlns:a="http://schemas.openxmlformats.org/drawingml/2006/main" noChangeAspect="1"/>
+            </wp:cNvGraphicFramePr>
+            <a:graphic xmlns:a="http://schemas.openxmlformats.org/drawingml/2006/main">
+              <a:graphicData uri="http://schemas.openxmlformats.org/drawingml/2006/picture">
+                <pic:pic xmlns:pic="http://schemas.openxmlformats.org/drawingml/2006/picture">
+                  <pic:nvPicPr>
+                    <pic:cNvPr id="0" name="Picture 2"/>
+                    <pic:cNvPicPr>
+                      <a:picLocks noChangeAspect="1" noChangeArrowheads="1"/>
+                    </pic:cNvPicPr>
+                  </pic:nvPicPr>
+                  <pic:blipFill>
+                    <a:blip r:embed="rId5" cstate="print">
+                      <a:extLst>
+                        <a:ext uri="{28A0092B-C50C-407E-A947-70E740481C1C}">
+                          <a14:useLocalDpi xmlns:a14="http://schemas.microsoft.com/office/drawing/2010/main" val="0"/>
+                        </a:ext>
+                      </a:extLst>
+                    </a:blip>
+                    <a:srcRect/>
+                    <a:stretch>
+                      <a:fillRect/>
+                    </a:stretch>
+                  </pic:blipFill>
+                  <pic:spPr bwMode="auto">
+                    <a:xfrm>
+                      <a:off x="0" y="0"/>
+                      <a:ext cx="5403234" cy="2222354"/>
+                    </a:xfrm>
+                    <a:prstGeom prst="rect">
+                      <a:avLst/>
+                    </a:prstGeom>
+                    <a:noFill/>
+                  </pic:spPr>
+                </pic:pic>
+              </a:graphicData>
+            </a:graphic>
+            <wp14:sizeRelH relativeFrom="margin">
+              <wp14:pctWidth>0</wp14:pctWidth>
+            </wp14:sizeRelH>
+            <wp14:sizeRelV relativeFrom="margin">
+              <wp14:pctHeight>0</wp14:pctHeight>
+            </wp14:sizeRelV>
+          </wp:anchor>
+        </w:drawing>
+      </w:r>
+    </w:p>
+    <w:p>
+      <w:pPr>
+        <w:spacing w:after="120" w:line="240" w:lineRule="auto"/>
+        <w:rPr>
+          <w:rFonts w:ascii="Arial" w:hAnsi="Arial" w:cs="Arial"/>
+          <w:sz w:val="22"/>
+          <w:szCs w:val="22"/>
+        </w:rPr>
+      </w:pPr>
+    </w:p>
+    <w:p>
+      <w:pPr>
+        <w:spacing w:after="120" w:line="240" w:lineRule="auto"/>
+        <w:rPr>
+          <w:rFonts w:ascii="Arial" w:hAnsi="Arial" w:cs="Arial"/>
+          <w:sz w:val="22"/>
+          <w:szCs w:val="22"/>
+        </w:rPr>
+      </w:pPr>
+    </w:p>
+    <w:p>
+      <w:pPr>
+        <w:spacing w:after="120" w:line="240" w:lineRule="auto"/>
+        <w:rPr>
+          <w:rFonts w:ascii="Arial" w:hAnsi="Arial" w:cs="Arial"/>
+          <w:sz w:val="22"/>
+          <w:szCs w:val="22"/>
+        </w:rPr>
+      </w:pPr>
+    </w:p>
+    <w:p>
+      <w:pPr>
+        <w:spacing w:after="120" w:line="240" w:lineRule="auto"/>
+        <w:rPr>
+          <w:rFonts w:ascii="Arial" w:hAnsi="Arial" w:cs="Arial"/>
+          <w:sz w:val="22"/>
+          <w:szCs w:val="22"/>
+        </w:rPr>
+      </w:pPr>
+    </w:p>
+    <w:p>
+      <w:pPr>
+        <w:spacing w:after="120" w:line="240" w:lineRule="auto"/>
+        <w:rPr>
+          <w:rFonts w:ascii="Arial" w:hAnsi="Arial" w:cs="Arial"/>
+          <w:sz w:val="22"/>
+          <w:szCs w:val="22"/>
+        </w:rPr>
+      </w:pPr>
+    </w:p>
+    <w:p>
+      <w:pPr>
+        <w:spacing w:after="120" w:line="240" w:lineRule="auto"/>
+        <w:rPr>
+          <w:rFonts w:ascii="Arial" w:hAnsi="Arial" w:cs="Arial"/>
+          <w:sz w:val="22"/>
+          <w:szCs w:val="22"/>
+        </w:rPr>
+      </w:pPr>
+    </w:p>
+    <w:p>
+      <w:pPr>
+        <w:spacing w:after="120" w:line="240" w:lineRule="auto"/>
+        <w:rPr>
+          <w:rFonts w:ascii="Arial" w:hAnsi="Arial" w:cs="Arial"/>
+          <w:sz w:val="22"/>
+          <w:szCs w:val="22"/>
+        </w:rPr>
+      </w:pPr>
+    </w:p>
+    <w:p>
+      <w:pPr>
+        <w:spacing w:after="120" w:line="240" w:lineRule="auto"/>
+        <w:rPr>
+          <w:rFonts w:ascii="Arial" w:hAnsi="Arial" w:cs="Arial"/>
+          <w:sz w:val="22"/>
+          <w:szCs w:val="22"/>
+        </w:rPr>
+      </w:pPr>
+    </w:p>
+    <w:p>
+      <w:pPr>
+        <w:spacing w:after="120" w:line="240" w:lineRule="auto"/>
+        <w:rPr>
+          <w:rFonts w:ascii="Arial" w:hAnsi="Arial" w:cs="Arial"/>
+          <w:sz w:val="22"/>
+          <w:szCs w:val="22"/>
+        </w:rPr>
+      </w:pPr>
+    </w:p>
+    <w:p>
+      <w:pPr>
+        <w:spacing w:after="0" w:line="240" w:lineRule="auto"/>
+        <w:jc w:val="both"/>
+        <w:rPr>
+          <w:rFonts w:ascii="Arial" w:hAnsi="Arial" w:cs="Arial"/>
+          <w:b/>
+          <w:bCs/>
+          <w:sz w:val="28"/>
+          <w:szCs w:val="28"/>
+        </w:rPr>
+      </w:pPr>
+    </w:p>
+    <w:p>
+      <w:pPr>
+        <w:spacing w:after="0" w:line="240" w:lineRule="auto"/>
+        <w:jc w:val="both"/>
+        <w:rPr>
+          <w:rFonts w:ascii="Arial" w:hAnsi="Arial" w:cs="Arial"/>
+          <w:b/>
+          <w:bCs/>
+          <w:sz w:val="28"/>
+          <w:szCs w:val="28"/>
+        </w:rPr>
+      </w:pPr>
+    </w:p>
+    <w:p>
+      <w:pPr>
+        <w:spacing w:after="0" w:line="240" w:lineRule="auto"/>
+        <w:jc w:val="both"/>
+        <w:rPr>
+          <w:rFonts w:ascii="Arial" w:hAnsi="Arial" w:cs="Arial"/>
+          <w:b/>
+          <w:bCs/>
+          <w:sz w:val="28"/>
+          <w:szCs w:val="28"/>
+        </w:rPr>
+      </w:pPr>
+      <w:r>
+        <w:rPr>
+          <w:rFonts w:ascii="Arial" w:hAnsi="Arial" w:cs="Arial"/>
+          <w:b/>
+          <w:bCs/>
+          <w:sz w:val="28"/>
+          <w:szCs w:val="28"/>
+        </w:rPr>
+        <w:t xml:space="preserve">Figure 1: composite score distribution in IUIS-IEI </w:t>
+      </w:r>
+    </w:p>
+    <w:p>
+      <w:pPr>
+        <w:spacing w:after="0" w:line="240" w:lineRule="auto"/>
+        <w:jc w:val="both"/>
+        <w:rPr>
+          <w:rFonts w:ascii="Arial" w:hAnsi="Arial" w:cs="Arial"/>
+          <w:b/>
+          <w:bCs/>
+          <w:sz w:val="28"/>
+          <w:szCs w:val="28"/>
+        </w:rPr>
+      </w:pPr>
+      <w:r>
+        <w:rPr>
+          <w:rFonts w:ascii="Arial" w:hAnsi="Arial" w:cs="Arial"/>
+          <w:b/>
+          <w:bCs/>
+          <w:sz w:val="28"/>
+          <w:szCs w:val="28"/>
+        </w:rPr>
+        <w:t>proteins and background</w:t>
+      </w:r>
+    </w:p>
+    <w:p>
+      <w:pPr>
+        <w:spacing w:after="0" w:line="240" w:lineRule="auto"/>
+        <w:rPr>
+          <w:rFonts w:ascii="Arial" w:hAnsi="Arial" w:cs="Arial"/>
+          <w:b/>
+          <w:bCs/>
+          <w:sz w:val="28"/>
+          <w:szCs w:val="28"/>
+        </w:rPr>
+      </w:pPr>
+      <w:r>
+        <w:rPr>
+          <w:rFonts w:ascii="Arial" w:hAnsi="Arial" w:cs="Arial"/>
+          <w:sz w:val="22"/>
+          <w:szCs w:val="22"/>
+        </w:rPr>
+        <w:drawing>
+          <wp:anchor distT="0" distB="0" distL="114300" distR="114300" simplePos="0" relativeHeight="251658240" behindDoc="0" locked="0" layoutInCell="1" allowOverlap="1" wp14:anchorId="4B368A35" wp14:editId="5F314E15">
+            <wp:simplePos x="0" y="0"/>
+            <wp:positionH relativeFrom="margin">
+              <wp:align>left</wp:align>
+            </wp:positionH>
+            <wp:positionV relativeFrom="paragraph">
+              <wp:posOffset>176276</wp:posOffset>
+            </wp:positionV>
+            <wp:extent cx="5410200" cy="3246120"/>
+            <wp:effectExtent l="0" t="0" r="0" b="0"/>
+            <wp:wrapNone/>
+            <wp:docPr id="1528790089" name="Graphic 1"/>
+            <wp:cNvGraphicFramePr>
+              <a:graphicFrameLocks xmlns:a="http://schemas.openxmlformats.org/drawingml/2006/main" noChangeAspect="1"/>
+            </wp:cNvGraphicFramePr>
+            <a:graphic xmlns:a="http://schemas.openxmlformats.org/drawingml/2006/main">
+              <a:graphicData uri="http://schemas.openxmlformats.org/drawingml/2006/picture">
+                <pic:pic xmlns:pic="http://schemas.openxmlformats.org/drawingml/2006/picture">
+                  <pic:nvPicPr>
+                    <pic:cNvPr id="1528790089" name=""/>
+                    <pic:cNvPicPr/>
+                  </pic:nvPicPr>
+                  <pic:blipFill>
+                    <a:blip r:embed="rId6">
+                      <a:extLst>
+                        <a:ext uri="{96DAC541-7B7A-43D3-8B79-37D633B846F1}">
+                          <asvg:svgBlip xmlns:asvg="http://schemas.microsoft.com/office/drawing/2016/SVG/main" r:embed="rId7"/>
+                        </a:ext>
+                      </a:extLst>
+                    </a:blip>
+                    <a:stretch>
+                      <a:fillRect/>
+                    </a:stretch>
+                  </pic:blipFill>
+                  <pic:spPr>
+                    <a:xfrm>
+                      <a:off x="0" y="0"/>
+                      <a:ext cx="5410200" cy="3246120"/>
+                    </a:xfrm>
+                    <a:prstGeom prst="rect">
+                      <a:avLst/>
+                    </a:prstGeom>
+                  </pic:spPr>
+                </pic:pic>
+              </a:graphicData>
+            </a:graphic>
+            <wp14:sizeRelH relativeFrom="margin">
+              <wp14:pctWidth>0</wp14:pctWidth>
+            </wp14:sizeRelH>
+            <wp14:sizeRelV relativeFrom="margin">
+              <wp14:pctHeight>0</wp14:pctHeight>
+            </wp14:sizeRelV>
+          </wp:anchor>
+        </w:drawing>
+      </w:r>
+    </w:p>
+    <w:p>
+      <w:pPr>
+        <w:spacing w:after="120" w:line="240" w:lineRule="auto"/>
+        <w:rPr>
+          <w:rFonts w:ascii="Arial" w:hAnsi="Arial" w:cs="Arial"/>
+          <w:sz w:val="22"/>
+          <w:szCs w:val="22"/>
+        </w:rPr>
+      </w:pPr>
+    </w:p>
+    <w:p>
+      <w:pPr>
+        <w:spacing w:after="120" w:line="240" w:lineRule="auto"/>
+        <w:rPr>
+          <w:rFonts w:ascii="Arial" w:hAnsi="Arial" w:cs="Arial"/>
+          <w:sz w:val="22"/>
+          <w:szCs w:val="22"/>
+        </w:rPr>
+      </w:pPr>
+    </w:p>
+    <w:p>
+      <w:pPr>
+        <w:spacing w:after="120" w:line="240" w:lineRule="auto"/>
+        <w:rPr>
+          <w:rFonts w:ascii="Arial" w:hAnsi="Arial" w:cs="Arial"/>
+          <w:sz w:val="22"/>
+          <w:szCs w:val="22"/>
+        </w:rPr>
+      </w:pPr>
+    </w:p>
+    <w:p>
+      <w:pPr>
+        <w:spacing w:after="120" w:line="240" w:lineRule="auto"/>
+        <w:rPr>
+          <w:rFonts w:ascii="Arial" w:hAnsi="Arial" w:cs="Arial"/>
+          <w:sz w:val="22"/>
+          <w:szCs w:val="22"/>
+        </w:rPr>
+      </w:pPr>
+    </w:p>
+    <w:p>
+      <w:pPr>
+        <w:spacing w:after="120" w:line="240" w:lineRule="auto"/>
+        <w:rPr>
+          <w:rFonts w:ascii="Arial" w:hAnsi="Arial" w:cs="Arial"/>
+          <w:sz w:val="22"/>
+          <w:szCs w:val="22"/>
+        </w:rPr>
+      </w:pPr>
+    </w:p>
+    <w:p>
+      <w:pPr>
+        <w:spacing w:after="120" w:line="240" w:lineRule="auto"/>
+        <w:rPr>
+          <w:rFonts w:ascii="Arial" w:hAnsi="Arial" w:cs="Arial"/>
+          <w:sz w:val="22"/>
+          <w:szCs w:val="22"/>
+        </w:rPr>
+      </w:pPr>
+    </w:p>
+    <w:p>
+      <w:pPr>
+        <w:spacing w:after="120" w:line="240" w:lineRule="auto"/>
+        <w:rPr>
+          <w:rFonts w:ascii="Arial" w:hAnsi="Arial" w:cs="Arial"/>
+          <w:sz w:val="22"/>
+          <w:szCs w:val="22"/>
+        </w:rPr>
+      </w:pPr>
+    </w:p>
+    <w:p>
+      <w:pPr>
+        <w:spacing w:after="120" w:line="240" w:lineRule="auto"/>
+        <w:rPr>
+          <w:rFonts w:ascii="Arial" w:hAnsi="Arial" w:cs="Arial"/>
+          <w:sz w:val="22"/>
+          <w:szCs w:val="22"/>
+        </w:rPr>
+      </w:pPr>
+    </w:p>
+    <w:p>
+      <w:pPr>
+        <w:spacing w:after="120" w:line="240" w:lineRule="auto"/>
+        <w:rPr>
+          <w:rFonts w:ascii="Arial" w:hAnsi="Arial" w:cs="Arial"/>
+          <w:sz w:val="22"/>
+          <w:szCs w:val="22"/>
+        </w:rPr>
+      </w:pPr>
+    </w:p>
+    <w:p>
+      <w:pPr>
+        <w:spacing w:after="120" w:line="240" w:lineRule="auto"/>
+        <w:rPr>
+          <w:rFonts w:ascii="Arial" w:hAnsi="Arial" w:cs="Arial"/>
+          <w:sz w:val="22"/>
+          <w:szCs w:val="22"/>
+        </w:rPr>
+      </w:pPr>
+    </w:p>
+    <w:p>
+      <w:pPr>
+        <w:spacing w:after="120" w:line="240" w:lineRule="auto"/>
+        <w:rPr>
+          <w:rFonts w:ascii="Arial" w:hAnsi="Arial" w:cs="Arial"/>
+          <w:sz w:val="22"/>
+          <w:szCs w:val="22"/>
+        </w:rPr>
+      </w:pPr>
+    </w:p>
+    <w:p>
+      <w:pPr>
+        <w:spacing w:after="120" w:line="240" w:lineRule="auto"/>
+        <w:rPr>
+          <w:rFonts w:ascii="Arial" w:hAnsi="Arial" w:cs="Arial"/>
+          <w:sz w:val="22"/>
+          <w:szCs w:val="22"/>
+        </w:rPr>
+      </w:pPr>
+    </w:p>
+    <w:p>
+      <w:pPr>
+        <w:spacing w:after="120" w:line="240" w:lineRule="auto"/>
+        <w:rPr>
+          <w:rFonts w:ascii="Arial" w:hAnsi="Arial" w:cs="Arial"/>
+          <w:sz w:val="22"/>
+          <w:szCs w:val="22"/>
+        </w:rPr>
+      </w:pPr>
+    </w:p>
+    <w:p>
+      <w:pPr>
+        <w:spacing w:after="120" w:line="240" w:lineRule="auto"/>
+        <w:jc w:val="both"/>
+        <w:rPr>
+          <w:rFonts w:ascii="Arial" w:hAnsi="Arial" w:cs="Arial"/>
+          <w:sz w:val="22"/>
+          <w:szCs w:val="22"/>
+        </w:rPr>
+      </w:pPr>
+    </w:p>
+    <w:p>
+      <w:pPr>
+        <w:spacing w:after="120" w:line="240" w:lineRule="auto"/>
+        <w:jc w:val="both"/>
+        <w:rPr>
+          <w:rFonts w:ascii="Arial" w:hAnsi="Arial" w:cs="Arial"/>
+          <w:b/>
+          <w:bCs/>
+          <w:sz w:val="28"/>
+          <w:szCs w:val="28"/>
+        </w:rPr>
+      </w:pPr>
+      <w:r>
+        <w:rPr>
+          <w:rFonts w:ascii="Arial" w:hAnsi="Arial" w:cs="Arial"/>
+          <w:sz w:val="22"/>
+          <w:szCs w:val="22"/>
+        </w:rPr>
+        <w:t xml:space="preserve">Of the 591 human genes in the IUIS-IEI expert committee's gene panel, 148 are included among the IEI-BISSH pipeline returns. </w:t>
+      </w:r>
+      <w:r>
+        <w:rPr>
+          <w:rFonts w:ascii="Arial" w:hAnsi="Arial" w:cs="Arial"/>
+          <w:sz w:val="22"/>
+          <w:szCs w:val="22"/>
+        </w:rPr>
+        <w:t xml:space="preserve">Those what were filtered out by the pipeline do not have a FoldSeek </w:t>
+      </w:r>
+      <m:oMath>
+        <m:r>
+          <w:rPr>
+            <w:rFonts w:ascii="Cambria Math" w:hAnsi="Cambria Math" w:cs="Arial"/>
+            <w:sz w:val="22"/>
+            <w:szCs w:val="22"/>
+          </w:rPr>
+          <m:t>evalue≤</m:t>
+        </m:r>
+        <m:r>
+          <w:rPr>
+            <w:rFonts w:ascii="Cambria Math" w:hAnsi="Cambria Math" w:cs="Arial"/>
+            <w:sz w:val="22"/>
+            <w:szCs w:val="22"/>
+          </w:rPr>
+          <m:t xml:space="preserve"> 0.05</m:t>
+        </m:r>
+      </m:oMath>
+      <w:r>
+        <w:rPr>
+          <w:rFonts w:ascii="Arial" w:hAnsi="Arial" w:cs="Arial"/>
+          <w:sz w:val="22"/>
+          <w:szCs w:val="22"/>
+        </w:rPr>
+        <w:t xml:space="preserve"> with a DefenseFinder protein. </w:t>
+      </w:r>
+      <w:r>
+        <w:rPr>
+          <w:rFonts w:ascii="Arial" w:hAnsi="Arial" w:cs="Arial"/>
+          <w:sz w:val="22"/>
+          <w:szCs w:val="22"/>
+        </w:rPr>
+        <w:t xml:space="preserve">The </w:t>
+      </w:r>
+      <w:r>
+        <w:rPr>
+          <w:rFonts w:ascii="Arial" w:hAnsi="Arial" w:cs="Arial"/>
+          <w:sz w:val="22"/>
+          <w:szCs w:val="22"/>
+        </w:rPr>
+        <w:t>mean</w:t>
+      </w:r>
+      <w:r>
+        <w:rPr>
+          <w:rFonts w:ascii="Arial" w:hAnsi="Arial" w:cs="Arial"/>
+          <w:sz w:val="22"/>
+          <w:szCs w:val="22"/>
+        </w:rPr>
+        <w:t xml:space="preserve"> composite score for protein pairs that map to IUIS-IEI genes is 0.1</w:t>
+      </w:r>
+      <w:r>
+        <w:rPr>
+          <w:rFonts w:ascii="Arial" w:hAnsi="Arial" w:cs="Arial"/>
+          <w:sz w:val="22"/>
+          <w:szCs w:val="22"/>
+        </w:rPr>
+        <w:t>4</w:t>
+      </w:r>
+      <w:r>
+        <w:rPr>
+          <w:rFonts w:ascii="Arial" w:hAnsi="Arial" w:cs="Arial"/>
+          <w:sz w:val="22"/>
+          <w:szCs w:val="22"/>
+        </w:rPr>
+        <w:t xml:space="preserve"> greater than background.</w:t>
+      </w:r>
+      <w:r>
+        <w:rPr>
+          <w:rFonts w:ascii="Arial" w:hAnsi="Arial" w:cs="Arial"/>
+          <w:b/>
+          <w:bCs/>
+          <w:sz w:val="28"/>
+          <w:szCs w:val="28"/>
+        </w:rPr>
+        <w:br w:type="page"/>
+      </w:r>
+    </w:p>
+    <w:p>
+      <w:pPr>
+        <w:spacing w:after="0" w:line="240" w:lineRule="auto"/>
+        <w:jc w:val="both"/>
+        <w:rPr>
+          <w:rFonts w:ascii="Arial" w:hAnsi="Arial" w:cs="Arial"/>
+          <w:b/>
+          <w:bCs/>
+          <w:sz w:val="28"/>
+          <w:szCs w:val="28"/>
+        </w:rPr>
+      </w:pPr>
+      <w:r>
+        <w:rPr>
+          <w:rFonts w:ascii="Arial" w:hAnsi="Arial" w:cs="Arial"/>
+          <w:b/>
+          <w:bCs/>
+          <w:sz w:val="28"/>
+          <w:szCs w:val="28"/>
+        </w:rPr>
+        <w:lastRenderedPageBreak/>
+        <w:t xml:space="preserve">Figure </w:t>
+      </w:r>
+      <w:r>
+        <w:rPr>
+          <w:rFonts w:ascii="Arial" w:hAnsi="Arial" w:cs="Arial"/>
+          <w:b/>
+          <w:bCs/>
+          <w:sz w:val="28"/>
+          <w:szCs w:val="28"/>
+        </w:rPr>
+        <w:t>2</w:t>
+      </w:r>
+      <w:r>
+        <w:rPr>
+          <w:rFonts w:ascii="Arial" w:hAnsi="Arial" w:cs="Arial"/>
+          <w:b/>
+          <w:bCs/>
+          <w:sz w:val="28"/>
+          <w:szCs w:val="28"/>
+        </w:rPr>
+        <w:t xml:space="preserve">: </w:t>
+      </w:r>
+      <w:r>
+        <w:rPr>
+          <w:rFonts w:ascii="Arial" w:hAnsi="Arial" w:cs="Arial"/>
+          <w:b/>
+          <w:bCs/>
+          <w:sz w:val="28"/>
+          <w:szCs w:val="28"/>
+        </w:rPr>
+        <w:t xml:space="preserve">27.9% of high-scoring pipeline hits </w:t>
+      </w:r>
+      <w:r>
+        <w:rPr>
+          <w:rFonts w:ascii="Arial" w:hAnsi="Arial" w:cs="Arial"/>
+          <w:b/>
+          <w:bCs/>
+          <w:sz w:val="28"/>
+          <w:szCs w:val="28"/>
+        </w:rPr>
+        <w:t xml:space="preserve">exhibit </w:t>
+      </w:r>
+    </w:p>
+    <w:p>
+      <w:pPr>
+        <w:spacing w:after="0" w:line="240" w:lineRule="auto"/>
+        <w:jc w:val="both"/>
+        <w:rPr>
+          <w:rFonts w:ascii="Arial" w:hAnsi="Arial" w:cs="Arial"/>
+          <w:b/>
+          <w:bCs/>
+          <w:sz w:val="28"/>
+          <w:szCs w:val="28"/>
+        </w:rPr>
+      </w:pPr>
+      <w:r>
+        <w:rPr>
+          <w:rFonts w:ascii="Arial" w:hAnsi="Arial" w:cs="Arial"/>
+          <w:b/>
+          <w:bCs/>
+          <w:sz w:val="28"/>
+          <w:szCs w:val="28"/>
+        </w:rPr>
+        <w:t>insignificant</w:t>
+      </w:r>
+      <w:r>
+        <w:rPr>
+          <w:rFonts w:ascii="Arial" w:hAnsi="Arial" w:cs="Arial"/>
+          <w:b/>
+          <w:bCs/>
+          <w:sz w:val="28"/>
+          <w:szCs w:val="28"/>
+        </w:rPr>
+        <w:t xml:space="preserve"> sequence homology</w:t>
+      </w:r>
+    </w:p>
+    <w:p>
+      <w:pPr>
+        <w:spacing w:after="0" w:line="240" w:lineRule="auto"/>
+        <w:rPr>
+          <w:rFonts w:ascii="Arial" w:hAnsi="Arial" w:cs="Arial"/>
+          <w:sz w:val="22"/>
+          <w:szCs w:val="22"/>
+        </w:rPr>
+      </w:pPr>
+    </w:p>
+    <w:p>
+      <w:pPr>
+        <w:spacing w:after="0" w:line="240" w:lineRule="auto"/>
+        <w:rPr>
+          <w:rFonts w:ascii="Arial" w:hAnsi="Arial" w:cs="Arial"/>
+          <w:b/>
+          <w:bCs/>
+          <w:sz w:val="28"/>
+          <w:szCs w:val="28"/>
+        </w:rPr>
+      </w:pPr>
+      <w:r>
+        <w:rPr>
+          <w:rFonts w:ascii="Arial" w:hAnsi="Arial" w:cs="Arial"/>
+          <w:b/>
+          <w:bCs/>
+          <w:noProof/>
+          <w:sz w:val="28"/>
+          <w:szCs w:val="28"/>
+        </w:rPr>
+        <mc:AlternateContent>
+          <mc:Choice Requires="wpg">
+            <w:drawing>
+              <wp:anchor distT="0" distB="0" distL="114300" distR="114300" simplePos="0" relativeHeight="251663360" behindDoc="0" locked="0" layoutInCell="1" allowOverlap="1" wp14:anchorId="2C1126DC" wp14:editId="3A54B3E8">
+                <wp:simplePos x="0" y="0"/>
+                <wp:positionH relativeFrom="margin">
+                  <wp:align>left</wp:align>
+                </wp:positionH>
+                <wp:positionV relativeFrom="paragraph">
+                  <wp:posOffset>6477</wp:posOffset>
+                </wp:positionV>
+                <wp:extent cx="5559552" cy="4238371"/>
+                <wp:effectExtent l="0" t="0" r="3175" b="0"/>
+                <wp:wrapNone/>
+                <wp:docPr id="931317245" name="Group 3"/>
+                <wp:cNvGraphicFramePr/>
+                <a:graphic xmlns:a="http://schemas.openxmlformats.org/drawingml/2006/main">
+                  <a:graphicData uri="http://schemas.microsoft.com/office/word/2010/wordprocessingGroup">
+                    <wpg:wgp>
+                      <wpg:cNvGrpSpPr/>
+                      <wpg:grpSpPr>
+                        <a:xfrm>
+                          <a:off x="0" y="0"/>
+                          <a:ext cx="5559552" cy="4238371"/>
+                          <a:chOff x="0" y="0"/>
+                          <a:chExt cx="5408295" cy="4123436"/>
+                        </a:xfrm>
+                      </wpg:grpSpPr>
+                      <pic:pic xmlns:pic="http://schemas.openxmlformats.org/drawingml/2006/picture">
+                        <pic:nvPicPr>
+                          <pic:cNvPr id="1461975827" name="Graphic 1"/>
+                          <pic:cNvPicPr>
+                            <a:picLocks noChangeAspect="1"/>
+                          </pic:cNvPicPr>
+                        </pic:nvPicPr>
+                        <pic:blipFill rotWithShape="1">
+                          <a:blip r:embed="rId8">
+                            <a:extLst>
+                              <a:ext uri="{96DAC541-7B7A-43D3-8B79-37D633B846F1}">
+                                <asvg:svgBlip xmlns:asvg="http://schemas.microsoft.com/office/drawing/2016/SVG/main" r:embed="rId9"/>
+                              </a:ext>
+                            </a:extLst>
+                          </a:blip>
+                          <a:srcRect t="7911" r="7522" b="5041"/>
+                          <a:stretch>
+                            <a:fillRect/>
+                          </a:stretch>
+                        </pic:blipFill>
+                        <pic:spPr bwMode="auto">
+                          <a:xfrm>
+                            <a:off x="0" y="0"/>
+                            <a:ext cx="5408295" cy="3822065"/>
+                          </a:xfrm>
+                          <a:prstGeom prst="rect">
+                            <a:avLst/>
+                          </a:prstGeom>
+                          <a:ln>
+                            <a:noFill/>
+                          </a:ln>
+                          <a:extLst>
+                            <a:ext uri="{53640926-AAD7-44D8-BBD7-CCE9431645EC}">
+                              <a14:shadowObscured xmlns:a14="http://schemas.microsoft.com/office/drawing/2010/main"/>
+                            </a:ext>
+                          </a:extLst>
+                        </pic:spPr>
+                      </pic:pic>
+                      <wps:wsp>
+                        <wps:cNvPr id="2015076955" name="Text Box 2"/>
+                        <wps:cNvSpPr txBox="1">
+                          <a:spLocks noChangeArrowheads="1"/>
+                        </wps:cNvSpPr>
+                        <wps:spPr bwMode="auto">
+                          <a:xfrm>
+                            <a:off x="1773936" y="3739896"/>
+                            <a:ext cx="2560320" cy="383540"/>
+                          </a:xfrm>
+                          <a:prstGeom prst="rect">
+                            <a:avLst/>
+                          </a:prstGeom>
+                          <a:noFill/>
+                          <a:ln w="9525">
+                            <a:noFill/>
+                            <a:miter lim="800000"/>
+                            <a:headEnd/>
+                            <a:tailEnd/>
+                          </a:ln>
+                        </wps:spPr>
+                        <wps:txbx>
+                          <w:txbxContent>
+                            <w:p>
+                              <w:pPr>
+                                <w:jc w:val="center"/>
+                                <w:rPr>
+                                  <w:rFonts w:ascii="Verdana Pro" w:hAnsi="Verdana Pro"/>
+                                </w:rPr>
+                              </w:pPr>
+                              <w:r>
+                                <w:rPr>
+                                  <w:rFonts w:ascii="Verdana Pro" w:hAnsi="Verdana Pro"/>
+                                </w:rPr>
+                                <w:t>Composite score</w:t>
+                              </w:r>
+                            </w:p>
+                          </w:txbxContent>
+                        </wps:txbx>
+                        <wps:bodyPr rot="0" vert="horz" wrap="square" lIns="91440" tIns="45720" rIns="91440" bIns="45720" anchor="t" anchorCtr="0">
+                          <a:noAutofit/>
+                        </wps:bodyPr>
+                      </wps:wsp>
+                    </wpg:wgp>
+                  </a:graphicData>
+                </a:graphic>
+                <wp14:sizeRelH relativeFrom="margin">
+                  <wp14:pctWidth>0</wp14:pctWidth>
+                </wp14:sizeRelH>
+                <wp14:sizeRelV relativeFrom="margin">
+                  <wp14:pctHeight>0</wp14:pctHeight>
+                </wp14:sizeRelV>
+              </wp:anchor>
+            </w:drawing>
+          </mc:Choice>
+          <mc:Fallback>
+            <w:pict>
+              <v:group w14:anchorId="2C1126DC" id="Group 3" o:spid="_x0000_s1026" style="position:absolute;margin-left:0;margin-top:.5pt;width:437.75pt;height:333.75pt;z-index:251663360;mso-position-horizontal:left;mso-position-horizontal-relative:margin;mso-width-relative:margin;mso-height-relative:margin" coordsize="54082,41234" o:gfxdata="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">
+                <v:shapetype id="_x0000_t75" coordsize="21600,21600" o:spt="75" o:preferrelative="t" path="m@4@5l@4@11@9@11@9@5xe" filled="f" stroked="f">
+                  <v:stroke joinstyle="miter"/>
+                  <v:formulas>
+                    <v:f eqn="if lineDrawn pixelLineWidth 0"/>
+                    <v:f eqn="sum @0 1 0"/>
+                    <v:f eqn="sum 0 0 @1"/>
+                    <v:f eqn="prod @2 1 2"/>
+                    <v:f eqn="prod @3 21600 pixelWidth"/>
+                    <v:f eqn="prod @3 21600 pixelHeight"/>
+                    <v:f eqn="sum @0 0 1"/>
+                    <v:f eqn="prod @6 1 2"/>
+                    <v:f eqn="prod @7 21600 pixelWidth"/>
+                    <v:f eqn="sum @8 21600 0"/>
+                    <v:f eqn="prod @7 21600 pixelHeight"/>
+                    <v:f eqn="sum @10 21600 0"/>
+                  </v:formulas>
+                  <v:path o:extrusionok="f" gradientshapeok="t" o:connecttype="rect"/>
+                  <o:lock v:ext="edit" aspectratio="t"/>
+                </v:shapetype>
+                <v:shape id="Graphic 1" o:spid="_x0000_s1027" type="#_x0000_t75" style="position:absolute;width:54082;height:38220;visibility:visible;mso-wrap-style:square" o:gfxdata="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">
+                  <v:imagedata r:id="rId10" o:title="" croptop="5185f" cropbottom="3304f" cropright="4930f"/>
+                </v:shape>
+                <v:shapetype id="_x0000_t202" coordsize="21600,21600" o:spt="202" path="m,l,21600r21600,l21600,xe">
+                  <v:stroke joinstyle="miter"/>
+                  <v:path gradientshapeok="t" o:connecttype="rect"/>
+                </v:shapetype>
+                <v:shape id="Text Box 2" o:spid="_x0000_s1028" type="#_x0000_t202" style="position:absolute;left:17739;top:37398;width:25603;height:3836;visibility:visible;mso-wrap-style:square;v-text-anchor:top" o:gfxdata="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" filled="f" stroked="f">
+                  <v:textbox>
+                    <w:txbxContent>
+                      <w:p>
+                        <w:pPr>
+                          <w:jc w:val="center"/>
+                          <w:rPr>
+                            <w:rFonts w:ascii="Verdana Pro" w:hAnsi="Verdana Pro"/>
+                          </w:rPr>
+                        </w:pPr>
+                        <w:r>
+                          <w:rPr>
+                            <w:rFonts w:ascii="Verdana Pro" w:hAnsi="Verdana Pro"/>
+                          </w:rPr>
+                          <w:t>Composite score</w:t>
+                        </w:r>
+                      </w:p>
+                    </w:txbxContent>
+                  </v:textbox>
+                </v:shape>
+                <w10:wrap anchorx="margin"/>
+              </v:group>
+            </w:pict>
+          </mc:Fallback>
+        </mc:AlternateContent>
+      </w:r>
+    </w:p>
+    <w:p>
+      <w:pPr>
+        <w:spacing w:after="0" w:line="240" w:lineRule="auto"/>
+        <w:rPr>
+          <w:rFonts w:ascii="Arial" w:hAnsi="Arial" w:cs="Arial"/>
+          <w:b/>
+          <w:bCs/>
+          <w:sz w:val="28"/>
+          <w:szCs w:val="28"/>
+        </w:rPr>
+      </w:pPr>
+    </w:p>
+    <w:p>
+      <w:pPr>
+        <w:spacing w:after="0" w:line="240" w:lineRule="auto"/>
+        <w:rPr>
+          <w:rFonts w:ascii="Arial" w:hAnsi="Arial" w:cs="Arial"/>
+          <w:b/>
+          <w:bCs/>
+          <w:sz w:val="28"/>
+          <w:szCs w:val="28"/>
+        </w:rPr>
+      </w:pPr>
+    </w:p>
+    <w:p>
+      <w:pPr>
+        <w:spacing w:after="0" w:line="240" w:lineRule="auto"/>
+        <w:rPr>
+          <w:rFonts w:ascii="Arial" w:hAnsi="Arial" w:cs="Arial"/>
+          <w:b/>
+          <w:bCs/>
+          <w:sz w:val="28"/>
+          <w:szCs w:val="28"/>
+        </w:rPr>
+      </w:pPr>
+    </w:p>
+    <w:p>
+      <w:pPr>
+        <w:spacing w:after="0" w:line="240" w:lineRule="auto"/>
+        <w:rPr>
+          <w:rFonts w:ascii="Arial" w:hAnsi="Arial" w:cs="Arial"/>
+          <w:b/>
+          <w:bCs/>
+          <w:sz w:val="28"/>
+          <w:szCs w:val="28"/>
+        </w:rPr>
+      </w:pPr>
+    </w:p>
+    <w:p>
+      <w:pPr>
+        <w:spacing w:after="0" w:line="240" w:lineRule="auto"/>
+        <w:rPr>
+          <w:rFonts w:ascii="Arial" w:hAnsi="Arial" w:cs="Arial"/>
+          <w:b/>
+          <w:bCs/>
+          <w:sz w:val="28"/>
+          <w:szCs w:val="28"/>
+        </w:rPr>
+      </w:pPr>
+    </w:p>
+    <w:p>
+      <w:pPr>
+        <w:spacing w:after="0" w:line="240" w:lineRule="auto"/>
+        <w:rPr>
+          <w:rFonts w:ascii="Arial" w:hAnsi="Arial" w:cs="Arial"/>
+          <w:b/>
+          <w:bCs/>
+          <w:sz w:val="28"/>
+          <w:szCs w:val="28"/>
+        </w:rPr>
+      </w:pPr>
+    </w:p>
+    <w:p>
+      <w:pPr>
+        <w:spacing w:after="120" w:line="240" w:lineRule="auto"/>
+        <w:rPr>
+          <w:rFonts w:ascii="Arial" w:hAnsi="Arial" w:cs="Arial"/>
+          <w:sz w:val="22"/>
+          <w:szCs w:val="22"/>
+        </w:rPr>
+      </w:pPr>
+      <w:r>
+        <w:rPr>
+          <w:rFonts w:ascii="Arial" w:hAnsi="Arial" w:cs="Arial"/>
+          <w:sz w:val="22"/>
+          <w:szCs w:val="22"/>
         </w:rPr>
         <w:t>txt</w:t>
       </w:r>
-    </w:p>
-    <w:p>
-      <w:pPr>
-        <w:spacing w:after="0" w:line="240" w:lineRule="auto"/>
-        <w:rPr>
-          <w:rFonts w:ascii="Arial" w:hAnsi="Arial" w:cs="Arial"/>
-        </w:rPr>
-      </w:pPr>
-      <w:r>
-        <w:rPr>
-          <w:rFonts w:ascii="Arial" w:hAnsi="Arial" w:cs="Arial"/>
-        </w:rPr>
-        <w:t>txt</w:t>
+      <w:r>
+        <w:rPr>
+          <w:rFonts w:eastAsiaTheme="minorEastAsia"/>
+          <w:noProof/>
+          <w:lang w:eastAsia="en-CA"/>
+        </w:rPr>
+        <w:t xml:space="preserve"> </w:t>
+      </w:r>
+    </w:p>
+    <w:p>
+      <w:pPr>
+        <w:spacing w:after="120" w:line="240" w:lineRule="auto"/>
+        <w:rPr>
+          <w:rFonts w:ascii="Arial" w:hAnsi="Arial" w:cs="Arial"/>
+          <w:sz w:val="22"/>
+          <w:szCs w:val="22"/>
+        </w:rPr>
+      </w:pPr>
+    </w:p>
+    <w:p>
+      <w:pPr>
+        <w:spacing w:after="120" w:line="240" w:lineRule="auto"/>
+        <w:rPr>
+          <w:rFonts w:ascii="Arial" w:hAnsi="Arial" w:cs="Arial"/>
+          <w:sz w:val="22"/>
+          <w:szCs w:val="22"/>
+        </w:rPr>
+      </w:pPr>
+    </w:p>
+    <w:p>
+      <w:pPr>
+        <w:spacing w:after="120" w:line="240" w:lineRule="auto"/>
+        <w:rPr>
+          <w:rFonts w:ascii="Arial" w:hAnsi="Arial" w:cs="Arial"/>
+          <w:sz w:val="22"/>
+          <w:szCs w:val="22"/>
+        </w:rPr>
+      </w:pPr>
+    </w:p>
+    <w:p>
+      <w:pPr>
+        <w:spacing w:after="120" w:line="240" w:lineRule="auto"/>
+        <w:rPr>
+          <w:rFonts w:ascii="Arial" w:hAnsi="Arial" w:cs="Arial"/>
+          <w:sz w:val="22"/>
+          <w:szCs w:val="22"/>
+        </w:rPr>
+      </w:pPr>
+    </w:p>
+    <w:p>
+      <w:pPr>
+        <w:spacing w:after="120" w:line="240" w:lineRule="auto"/>
+        <w:rPr>
+          <w:rFonts w:ascii="Arial" w:hAnsi="Arial" w:cs="Arial"/>
+          <w:sz w:val="22"/>
+          <w:szCs w:val="22"/>
+        </w:rPr>
+      </w:pPr>
+    </w:p>
+    <w:p>
+      <w:pPr>
+        <w:spacing w:after="120" w:line="240" w:lineRule="auto"/>
+        <w:rPr>
+          <w:rFonts w:ascii="Arial" w:hAnsi="Arial" w:cs="Arial"/>
+          <w:sz w:val="22"/>
+          <w:szCs w:val="22"/>
+        </w:rPr>
+      </w:pPr>
+    </w:p>
+    <w:p>
+      <w:pPr>
+        <w:spacing w:after="120" w:line="240" w:lineRule="auto"/>
+        <w:rPr>
+          <w:rFonts w:ascii="Arial" w:hAnsi="Arial" w:cs="Arial"/>
+          <w:sz w:val="22"/>
+          <w:szCs w:val="22"/>
+        </w:rPr>
+      </w:pPr>
+    </w:p>
+    <w:p>
+      <w:pPr>
+        <w:spacing w:after="120" w:line="240" w:lineRule="auto"/>
+        <w:rPr>
+          <w:rFonts w:ascii="Arial" w:hAnsi="Arial" w:cs="Arial"/>
+          <w:sz w:val="22"/>
+          <w:szCs w:val="22"/>
+        </w:rPr>
+      </w:pPr>
+    </w:p>
+    <w:p>
+      <w:pPr>
+        <w:spacing w:after="120" w:line="240" w:lineRule="auto"/>
+        <w:rPr>
+          <w:rFonts w:ascii="Arial" w:hAnsi="Arial" w:cs="Arial"/>
+          <w:sz w:val="22"/>
+          <w:szCs w:val="22"/>
+        </w:rPr>
+      </w:pPr>
+    </w:p>
+    <w:p>
+      <w:pPr>
+        <w:spacing w:after="120" w:line="240" w:lineRule="auto"/>
+        <w:rPr>
+          <w:rFonts w:ascii="Arial" w:hAnsi="Arial" w:cs="Arial"/>
+          <w:sz w:val="22"/>
+          <w:szCs w:val="22"/>
+        </w:rPr>
+      </w:pPr>
+    </w:p>
+    <w:p>
+      <w:pPr>
+        <w:spacing w:after="120" w:line="240" w:lineRule="auto"/>
+        <w:rPr>
+          <w:rFonts w:ascii="Arial" w:hAnsi="Arial" w:cs="Arial"/>
+          <w:sz w:val="22"/>
+          <w:szCs w:val="22"/>
+        </w:rPr>
+      </w:pPr>
+    </w:p>
+    <w:p>
+      <w:pPr>
+        <w:spacing w:after="120" w:line="240" w:lineRule="auto"/>
+        <w:jc w:val="both"/>
+        <w:rPr>
+          <w:rFonts w:ascii="Arial" w:hAnsi="Arial" w:cs="Arial"/>
+          <w:sz w:val="22"/>
+          <w:szCs w:val="22"/>
+        </w:rPr>
+      </w:pPr>
+      <w:r>
+        <w:rPr>
+          <w:rFonts w:ascii="Arial" w:hAnsi="Arial" w:cs="Arial"/>
+          <w:sz w:val="22"/>
+          <w:szCs w:val="22"/>
+        </w:rPr>
+        <w:t>Each point represents a human-bacterial protein pair in the high-scoring (</w:t>
+      </w:r>
+      <m:oMath>
+        <m:r>
+          <w:rPr>
+            <w:rFonts w:ascii="Cambria Math" w:hAnsi="Cambria Math" w:cs="Arial"/>
+            <w:sz w:val="22"/>
+            <w:szCs w:val="22"/>
+          </w:rPr>
+          <m:t>composit</m:t>
+        </m:r>
+        <m:sSub>
+          <m:sSubPr>
+            <m:ctrlPr>
+              <w:rPr>
+                <w:rFonts w:ascii="Cambria Math" w:hAnsi="Cambria Math" w:cs="Arial"/>
+                <w:i/>
+                <w:sz w:val="22"/>
+                <w:szCs w:val="22"/>
+              </w:rPr>
+            </m:ctrlPr>
+          </m:sSubPr>
+          <m:e>
+            <m:r>
+              <w:rPr>
+                <w:rFonts w:ascii="Cambria Math" w:hAnsi="Cambria Math" w:cs="Arial"/>
+                <w:sz w:val="22"/>
+                <w:szCs w:val="22"/>
+              </w:rPr>
+              <m:t>e</m:t>
+            </m:r>
+          </m:e>
+          <m:sub>
+            <m:r>
+              <w:rPr>
+                <w:rFonts w:ascii="Cambria Math" w:hAnsi="Cambria Math" w:cs="Arial"/>
+                <w:sz w:val="22"/>
+                <w:szCs w:val="22"/>
+              </w:rPr>
+              <m:t>score</m:t>
+            </m:r>
+          </m:sub>
+        </m:sSub>
+        <m:r>
+          <w:rPr>
+            <w:rFonts w:ascii="Cambria Math" w:hAnsi="Cambria Math" w:cs="Arial"/>
+            <w:sz w:val="22"/>
+            <w:szCs w:val="22"/>
+          </w:rPr>
+          <m:t>≥0.85</m:t>
+        </m:r>
+      </m:oMath>
+      <w:r>
+        <w:rPr>
+          <w:rFonts w:ascii="Arial" w:hAnsi="Arial" w:cs="Arial"/>
+          <w:sz w:val="22"/>
+          <w:szCs w:val="22"/>
+        </w:rPr>
+        <w:t>) dataset.</w:t>
+      </w:r>
+      <w:r>
+        <w:rPr>
+          <w:rFonts w:ascii="Arial" w:hAnsi="Arial" w:cs="Arial"/>
+          <w:sz w:val="22"/>
+          <w:szCs w:val="22"/>
+        </w:rPr>
+        <w:t xml:space="preserve"> Darker colour indicates overlapping points. BLASTp alignment fails for 42 of the 1,849 protein pairs. 503 if the 1,806</w:t>
+      </w:r>
+      <w:r>
+        <w:rPr>
+          <w:rFonts w:ascii="Arial" w:hAnsi="Arial" w:cs="Arial"/>
+          <w:sz w:val="22"/>
+          <w:szCs w:val="22"/>
+        </w:rPr>
+        <w:t xml:space="preserve"> (27.9%)</w:t>
+      </w:r>
+      <w:r>
+        <w:rPr>
+          <w:rFonts w:ascii="Arial" w:hAnsi="Arial" w:cs="Arial"/>
+          <w:sz w:val="22"/>
+          <w:szCs w:val="22"/>
+        </w:rPr>
+        <w:t xml:space="preserve"> valid BLASTp returns fall below the BLASTp </w:t>
+      </w:r>
+      <m:oMath>
+        <m:r>
+          <w:rPr>
+            <w:rFonts w:ascii="Cambria Math" w:hAnsi="Cambria Math" w:cs="Arial"/>
+            <w:sz w:val="22"/>
+            <w:szCs w:val="22"/>
+          </w:rPr>
+          <m:t>evalue</m:t>
+        </m:r>
+        <m:r>
+          <w:rPr>
+            <w:rFonts w:ascii="Cambria Math" w:hAnsi="Cambria Math" w:cs="Arial"/>
+            <w:sz w:val="22"/>
+            <w:szCs w:val="22"/>
+          </w:rPr>
+          <m:t>≤</m:t>
+        </m:r>
+        <m:sSup>
+          <m:sSupPr>
+            <m:ctrlPr>
+              <w:rPr>
+                <w:rFonts w:ascii="Cambria Math" w:eastAsiaTheme="minorEastAsia" w:hAnsi="Cambria Math" w:cs="Arial"/>
+                <w:i/>
+                <w:sz w:val="22"/>
+                <w:szCs w:val="22"/>
+              </w:rPr>
+            </m:ctrlPr>
+          </m:sSupPr>
+          <m:e>
+            <m:r>
+              <w:rPr>
+                <w:rFonts w:ascii="Cambria Math" w:eastAsiaTheme="minorEastAsia" w:hAnsi="Cambria Math" w:cs="Arial"/>
+                <w:sz w:val="22"/>
+                <w:szCs w:val="22"/>
+              </w:rPr>
+              <m:t>10</m:t>
+            </m:r>
+            <m:ctrlPr>
+              <w:rPr>
+                <w:rFonts w:ascii="Cambria Math" w:hAnsi="Cambria Math" w:cs="Arial"/>
+                <w:i/>
+                <w:sz w:val="22"/>
+                <w:szCs w:val="22"/>
+              </w:rPr>
+            </m:ctrlPr>
+          </m:e>
+          <m:sup>
+            <m:r>
+              <w:rPr>
+                <w:rFonts w:ascii="Cambria Math" w:eastAsiaTheme="minorEastAsia" w:hAnsi="Cambria Math" w:cs="Arial"/>
+                <w:sz w:val="22"/>
+                <w:szCs w:val="22"/>
+              </w:rPr>
+              <m:t>-3</m:t>
+            </m:r>
+          </m:sup>
+        </m:sSup>
+      </m:oMath>
+      <w:r>
+        <w:rPr>
+          <w:rFonts w:ascii="Arial" w:eastAsiaTheme="minorEastAsia" w:hAnsi="Arial" w:cs="Arial"/>
+          <w:sz w:val="22"/>
+          <w:szCs w:val="22"/>
+        </w:rPr>
+        <w:t xml:space="preserve"> significance threshold, </w:t>
+      </w:r>
+      <w:r>
+        <w:rPr>
+          <w:rFonts w:ascii="Arial" w:hAnsi="Arial" w:cs="Arial"/>
+          <w:sz w:val="22"/>
+          <w:szCs w:val="22"/>
+        </w:rPr>
+        <w:t xml:space="preserve"> suggesting the IEI-BISSH pipeline recovers conservation relationships that cannot be </w:t>
+      </w:r>
+      <w:r>
+        <w:rPr>
+          <w:rFonts w:ascii="Arial" w:hAnsi="Arial" w:cs="Arial"/>
+          <w:sz w:val="22"/>
+          <w:szCs w:val="22"/>
+        </w:rPr>
+        <w:t>detected</w:t>
+      </w:r>
+      <w:r>
+        <w:rPr>
+          <w:rFonts w:ascii="Arial" w:hAnsi="Arial" w:cs="Arial"/>
+          <w:sz w:val="22"/>
+          <w:szCs w:val="22"/>
+        </w:rPr>
+        <w:t xml:space="preserve"> by sequence homology alone.</w:t>
+      </w:r>
+    </w:p>
+    <w:p>
+      <w:pPr>
+        <w:spacing w:after="120" w:line="240" w:lineRule="auto"/>
+        <w:rPr>
+          <w:rFonts w:ascii="Arial" w:hAnsi="Arial" w:cs="Arial"/>
+          <w:sz w:val="22"/>
+          <w:szCs w:val="22"/>
+        </w:rPr>
+      </w:pPr>
+    </w:p>
+    <w:p>
+      <w:pPr>
+        <w:spacing w:after="120" w:line="240" w:lineRule="auto"/>
+        <w:rPr>
+          <w:rFonts w:ascii="Arial" w:hAnsi="Arial" w:cs="Arial"/>
+          <w:sz w:val="22"/>
+          <w:szCs w:val="22"/>
+        </w:rPr>
+      </w:pPr>
+    </w:p>
+    <w:p>
+      <w:pPr>
+        <w:rPr>
+          <w:rFonts w:ascii="Arial" w:hAnsi="Arial" w:cs="Arial"/>
+          <w:b/>
+          <w:bCs/>
+          <w:sz w:val="28"/>
+          <w:szCs w:val="28"/>
+        </w:rPr>
+      </w:pPr>
+      <w:r>
+        <w:rPr>
+          <w:rFonts w:ascii="Arial" w:hAnsi="Arial" w:cs="Arial"/>
+          <w:b/>
+          <w:bCs/>
+          <w:sz w:val="28"/>
+          <w:szCs w:val="28"/>
+        </w:rPr>
+        <w:br w:type="page"/>
       </w:r>
     </w:p>
     <w:sectPr>
@@ -1872,6 +3077,7 @@
   <w:style w:type="paragraph" w:default="1" w:styleId="Normal">
     <w:name w:val="Normal"/>
     <w:qFormat/>
+    <w:rsid w:val="00AF72EB"/>
   </w:style>
   <w:style w:type="paragraph" w:styleId="Heading1">
     <w:name w:val="heading 1"/>
@@ -2075,7 +3281,6 @@
   <w:style w:type="character" w:default="1" w:styleId="DefaultParagraphFont">
     <w:name w:val="Default Paragraph Font"/>
     <w:uiPriority w:val="1"/>
-    <w:semiHidden/>
     <w:unhideWhenUsed/>
   </w:style>
   <w:style w:type="table" w:default="1" w:styleId="TableNormal">
@@ -2408,6 +3613,39 @@
       </w:tblBorders>
     </w:tblPr>
   </w:style>
+  <w:style w:type="character" w:styleId="Hyperlink">
+    <w:name w:val="Hyperlink"/>
+    <w:basedOn w:val="DefaultParagraphFont"/>
+    <w:uiPriority w:val="99"/>
+    <w:unhideWhenUsed/>
+    <w:rsid w:val="00814A9E"/>
+    <w:rPr>
+      <w:color w:val="467886" w:themeColor="hyperlink"/>
+      <w:u w:val="single"/>
+    </w:rPr>
+  </w:style>
+  <w:style w:type="character" w:styleId="UnresolvedMention">
+    <w:name w:val="Unresolved Mention"/>
+    <w:basedOn w:val="DefaultParagraphFont"/>
+    <w:uiPriority w:val="99"/>
+    <w:semiHidden/>
+    <w:unhideWhenUsed/>
+    <w:rsid w:val="00814A9E"/>
+    <w:rPr>
+      <w:color w:val="605E5C"/>
+      <w:shd w:val="clear" w:color="auto" w:fill="E1DFDD"/>
+    </w:rPr>
+  </w:style>
+  <w:style w:type="character" w:styleId="PlaceholderText">
+    <w:name w:val="Placeholder Text"/>
+    <w:basedOn w:val="DefaultParagraphFont"/>
+    <w:uiPriority w:val="99"/>
+    <w:semiHidden/>
+    <w:rsid w:val="008A5270"/>
+    <w:rPr>
+      <w:color w:val="666666"/>
+    </w:rPr>
+  </w:style>
 </w:styles>
 </file>
 

</xml_diff>

<commit_message>
Added subpanel annotation back in.
</commit_message>
<xml_diff>
--- a/results/2026-10_geneList_c_marshall/2026-10-15_iei-geneList_report.docx
+++ b/results/2026-10_geneList_c_marshall/2026-10-15_iei-geneList_report.docx
@@ -1260,6 +1260,48 @@
               </w:rPr>
               <w:t>threshold for significant sequence homology.</w:t>
             </w:r>
+          </w:p>
+        </w:tc>
+      </w:tr>
+      <w:tr>
+        <w:tc>
+          <w:tcPr>
+            <w:tcW w:w="2785" w:type="dxa"/>
+          </w:tcPr>
+          <w:p>
+            <w:pPr>
+              <w:spacing w:after="120"/>
+              <w:jc w:val="both"/>
+              <w:rPr>
+                <w:rFonts w:ascii="Arial" w:hAnsi="Arial" w:cs="Arial"/>
+                <w:sz w:val="20"/>
+                <w:szCs w:val="20"/>
+              </w:rPr>
+            </w:pPr>
+            <w:r>
+              <w:rPr>
+                <w:rFonts w:ascii="Arial" w:hAnsi="Arial" w:cs="Arial"/>
+                <w:sz w:val="20"/>
+                <w:szCs w:val="20"/>
+              </w:rPr>
+              <w:t>marshall_immune_subpanel</w:t>
+            </w:r>
+          </w:p>
+        </w:tc>
+        <w:tc>
+          <w:tcPr>
+            <w:tcW w:w="6030" w:type="dxa"/>
+          </w:tcPr>
+          <w:p>
+            <w:pPr>
+              <w:spacing w:after="120"/>
+              <w:jc w:val="both"/>
+              <w:rPr>
+                <w:rFonts w:ascii="Arial" w:hAnsi="Arial" w:cs="Arial"/>
+                <w:sz w:val="20"/>
+                <w:szCs w:val="20"/>
+              </w:rPr>
+            </w:pPr>
           </w:p>
         </w:tc>
       </w:tr>
@@ -2193,7 +2235,7 @@
                   <v:path o:extrusionok="f" gradientshapeok="t" o:connecttype="rect"/>
                   <o:lock v:ext="edit" aspectratio="t"/>
                 </v:shapetype>
-                <v:shape id="Graphic 1" o:spid="_x0000_s1027" type="#_x0000_t75" style="position:absolute;width:54082;height:38220;visibility:visible;mso-wrap-style:square" o:gfxdata="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">
+                <v:shape id="Graphic 1" o:spid="_x0000_s1027" type="#_x0000_t75" style="position:absolute;width:54082;height:38220;visibility:visible;mso-wrap-style:square" o:gfxdata="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">
                   <v:imagedata r:id="rId10" o:title="" croptop="5185f" cropbottom="3304f" cropright="4930f"/>
                 </v:shape>
                 <v:shapetype id="_x0000_t202" coordsize="21600,21600" o:spt="202" path="m,l,21600r21600,l21600,xe">

</xml_diff>